<commit_message>
Rev 3: benefits and business case section (airline and OEM value, datalink product failure prediction, early in-service detection, USD pricing, cost and revenue scenarios) with Figures 7 and 8
Co-authored-by: arena-agent <297053741+arena-agent@users.noreply.github.com>
</commit_message>
<xml_diff>
--- a/Datalink_AI_Live_Architecture.docx
+++ b/Datalink_AI_Live_Architecture.docx
@@ -36,7 +36,7 @@
           <w:color w:val="1F3355"/>
           <w:sz w:val="19"/>
         </w:rPr>
-        <w:t>Revision 2 · 8 October 2026 · adds six figures, a full end-to-end worked example (flight AI102) and a walkthrough of the sample dashboard</w:t>
+        <w:t>Revision 3 · 8 October 2026 · adds the benefits and business case: failure prediction for the datalink product itself, in-service issues found before the customer reports them, what the platform is worth to an airline and to an OEM such as Honeywell Aerospace, and how much can be earned (USD)</w:t>
       </w:r>
     </w:p>
     <w:p>
@@ -174,7 +174,21 @@
         <w:t xml:space="preserve">8. </w:t>
       </w:r>
       <w:r>
-        <w:t>Build order   ·   9. Patent position   ·   10. Risks</w:t>
+        <w:t>Benefits and the business case — Figure 7 who gains and what they pay, Figure 8 cost and revenue scenarios: failure prediction for the datalink product itself, in-service issues found before the customer reports them, value to the airline and to the OEM, and how much can be earned</w:t>
+      </w:r>
+    </w:p>
+    <w:p>
+      <w:pPr>
+        <w:pStyle w:val="ListBullet"/>
+      </w:pPr>
+      <w:r>
+        <w:rPr>
+          <w:b/>
+        </w:rPr>
+        <w:t xml:space="preserve">9. </w:t>
+      </w:r>
+      <w:r>
+        <w:t>Build order   ·   10. Patent position   ·   11. Risks</w:t>
       </w:r>
     </w:p>
     <w:p>
@@ -12138,7 +12152,1163 @@
         <w:pStyle w:val="Heading1"/>
       </w:pPr>
       <w:r>
-        <w:t>8. Build order</w:t>
+        <w:t>8. Benefits and the business case: who gains, how much, and how much can be earned</w:t>
+      </w:r>
+    </w:p>
+    <w:p>
+      <w:r>
+        <w:rPr>
+          <w:b w:val="0"/>
+          <w:i w:val="0"/>
+        </w:rPr>
+        <w:t>This section answers three questions that a technical document normally dodges. First, what does the platform actually do for the two parties that pay for it — the airline that flies the aircraft and the OEM whose datalink product is on board, for example Honeywell Aerospace? Second, what is that worth in money, and how would we know? Third, how much can the platform owner earn from it? Every figure below is an indicative planning estimate for 2026–2028, order of magnitude only, and every one of them is an assumption to be validated by customer interviews — not a forecast. What is not soft is the mechanism: each benefit line below traces back to something this architecture already produces, and Section 6 shows the whole chain running on one flight.</w:t>
+      </w:r>
+    </w:p>
+    <w:p>
+      <w:pPr>
+        <w:ind w:left="173"/>
+        <w:pBdr>
+          <w:top w:val="single" w:sz="6" w:space="5" w:color="BFA100"/>
+          <w:bottom w:val="single" w:sz="6" w:space="5" w:color="BFA100"/>
+          <w:left w:val="single" w:sz="6" w:space="5" w:color="BFA100"/>
+          <w:right w:val="single" w:sz="6" w:space="5" w:color="BFA100"/>
+        </w:pBdr>
+        <w:shd w:fill="FFF4CE"/>
+      </w:pPr>
+      <w:r>
+        <w:rPr>
+          <w:sz w:val="19"/>
+        </w:rPr>
+        <w:t>The one-sentence version: the platform sells evidence. Evidence that a defect exists (which the airline needs), evidence that a product failed in a specific way in a specific configuration (which the OEM needs), and evidence that a requirement was or was not met in service (which both need, and which nobody currently produces). Failure prediction and early detection are not extra features bolted on — they are what you get when the same evidence stream is retained, aligned and attributed.</w:t>
+      </w:r>
+    </w:p>
+    <w:p>
+      <w:pPr>
+        <w:pStyle w:val="Heading2"/>
+      </w:pPr>
+      <w:r>
+        <w:t>8.1 Two capabilities the customer feels directly</w:t>
+      </w:r>
+    </w:p>
+    <w:tbl>
+      <w:tblPr>
+        <w:tblStyle w:val="TableGrid"/>
+        <w:tblW w:type="auto" w:w="0"/>
+        <w:jc w:val="center"/>
+        <w:tblLook w:firstColumn="1" w:firstRow="1" w:lastColumn="0" w:lastRow="0" w:noHBand="0" w:noVBand="1" w:val="04A0"/>
+      </w:tblPr>
+      <w:tblGrid>
+        <w:gridCol w:w="3312"/>
+        <w:gridCol w:w="3312"/>
+        <w:gridCol w:w="3312"/>
+      </w:tblGrid>
+      <w:tr>
+        <w:tc>
+          <w:tcPr>
+            <w:tcW w:type="dxa" w:w="3312"/>
+            <w:shd w:fill="DCE6F1"/>
+          </w:tcPr>
+          <w:p>
+            <w:r/>
+            <w:r>
+              <w:rPr>
+                <w:b/>
+                <w:sz w:val="18"/>
+              </w:rPr>
+              <w:t>Capability</w:t>
+            </w:r>
+          </w:p>
+        </w:tc>
+        <w:tc>
+          <w:tcPr>
+            <w:tcW w:type="dxa" w:w="3312"/>
+            <w:shd w:fill="DCE6F1"/>
+          </w:tcPr>
+          <w:p>
+            <w:r/>
+            <w:r>
+              <w:rPr>
+                <w:b/>
+                <w:sz w:val="18"/>
+              </w:rPr>
+              <w:t>What it means mechanically</w:t>
+            </w:r>
+          </w:p>
+        </w:tc>
+        <w:tc>
+          <w:tcPr>
+            <w:tcW w:type="dxa" w:w="3312"/>
+            <w:shd w:fill="DCE6F1"/>
+          </w:tcPr>
+          <w:p>
+            <w:r/>
+            <w:r>
+              <w:rPr>
+                <w:b/>
+                <w:sz w:val="18"/>
+              </w:rPr>
+              <w:t>Why it is new</w:t>
+            </w:r>
+          </w:p>
+        </w:tc>
+      </w:tr>
+      <w:tr>
+        <w:tc>
+          <w:tcPr>
+            <w:tcW w:type="dxa" w:w="3312"/>
+          </w:tcPr>
+          <w:p>
+            <w:pPr>
+              <w:spacing w:after="40"/>
+            </w:pPr>
+            <w:r/>
+            <w:r>
+              <w:rPr>
+                <w:sz w:val="18"/>
+              </w:rPr>
+              <w:t>Prediction of datalink product internal failure</w:t>
+            </w:r>
+          </w:p>
+        </w:tc>
+        <w:tc>
+          <w:tcPr>
+            <w:tcW w:type="dxa" w:w="3312"/>
+          </w:tcPr>
+          <w:p>
+            <w:pPr>
+              <w:spacing w:after="40"/>
+            </w:pPr>
+            <w:r/>
+            <w:r>
+              <w:rPr>
+                <w:sz w:val="18"/>
+              </w:rPr>
+              <w:t>Partition execution against budget, overrun counts, jitter, queue depth, watchdog and fault events and re-instantiation counts are tracked per tail, per software load and per database revision. Change-point detection (CUSUM) and margin decay against the acceptance criterion produce an alarm while the requirement is still formally conforming, and a projected date of violation. A physical root cause is then bounded by maintenance, and the confirmation or rejection becomes a label.</w:t>
+            </w:r>
+          </w:p>
+        </w:tc>
+        <w:tc>
+          <w:tcPr>
+            <w:tcW w:type="dxa" w:w="3312"/>
+          </w:tcPr>
+          <w:p>
+            <w:pPr>
+              <w:spacing w:after="40"/>
+            </w:pPr>
+            <w:r/>
+            <w:r>
+              <w:rPr>
+                <w:sz w:val="18"/>
+              </w:rPr>
+              <w:t>Existing health monitoring flags a threshold when it is crossed, or reports after a flight. Margin decay against a requirement, on the aircraft trailing the fleet, with the evidence attached, is what turns "conforming with little room left" into a scheduled action instead of an AOG. Figure 6 (left) is this exact finding.</w:t>
+            </w:r>
+          </w:p>
+        </w:tc>
+      </w:tr>
+      <w:tr>
+        <w:tc>
+          <w:tcPr>
+            <w:tcW w:type="dxa" w:w="3312"/>
+          </w:tcPr>
+          <w:p>
+            <w:pPr>
+              <w:spacing w:after="40"/>
+            </w:pPr>
+            <w:r/>
+            <w:r>
+              <w:rPr>
+                <w:sz w:val="18"/>
+              </w:rPr>
+              <w:t>In-service issues identified before the customer reports them</w:t>
+            </w:r>
+          </w:p>
+        </w:tc>
+        <w:tc>
+          <w:tcPr>
+            <w:tcW w:type="dxa" w:w="3312"/>
+          </w:tcPr>
+          <w:p>
+            <w:pPr>
+              <w:spacing w:after="40"/>
+            </w:pPr>
+            <w:r/>
+            <w:r>
+              <w:rPr>
+                <w:sz w:val="18"/>
+              </w:rPr>
+              <w:t>A defect is detected server-side at the moment the evidence arrives — a loss burst, an unacknowledged uplink, a partition overrun inside a transmit window, a handover failure cluster in one airspace — and reaches engineering with the transaction, the timestamps and the raw record hash, often while the aircraft is still in the air. The customer learns about the defect from the platform, not from a crew report, a delay or a complaint.</w:t>
+            </w:r>
+          </w:p>
+        </w:tc>
+        <w:tc>
+          <w:tcPr>
+            <w:tcW w:type="dxa" w:w="3312"/>
+          </w:tcPr>
+          <w:p>
+            <w:pPr>
+              <w:spacing w:after="40"/>
+            </w:pPr>
+            <w:r/>
+            <w:r>
+              <w:rPr>
+                <w:sz w:val="18"/>
+              </w:rPr>
+              <w:t>Today the OEM learns about most intermittent comms behaviour from the customer, weeks or months later, usually as a support ticket that says "the datalink misbehaved" with no synchronised timestamps and no way to tell avionics from radio from crew. This platform reverses the direction of that information flow, which is the single largest commercial benefit in the whole idea.</w:t>
+            </w:r>
+          </w:p>
+        </w:tc>
+      </w:tr>
+    </w:tbl>
+    <w:p>
+      <w:pPr>
+        <w:spacing w:after="40"/>
+      </w:pPr>
+    </w:p>
+    <w:p>
+      <w:r>
+        <w:rPr>
+          <w:b w:val="0"/>
+          <w:i w:val="0"/>
+        </w:rPr>
+        <w:t>The two capabilities are the same pipeline read at different time scales: early detection is the same syndrome found at the moment it occurs; prediction is the same syndrome recognised in its trend before it becomes an occurrence. Both are only possible because the platform keeps the requirement, the configuration and the raw evidence together — which is the invention.</w:t>
+      </w:r>
+    </w:p>
+    <w:p>
+      <w:pPr>
+        <w:pStyle w:val="Heading2"/>
+      </w:pPr>
+      <w:r>
+        <w:t>8.2 Benefit to the airline (the operator)</w:t>
+      </w:r>
+    </w:p>
+    <w:tbl>
+      <w:tblPr>
+        <w:tblStyle w:val="TableGrid"/>
+        <w:tblW w:type="auto" w:w="0"/>
+        <w:jc w:val="center"/>
+        <w:tblLook w:firstColumn="1" w:firstRow="1" w:lastColumn="0" w:lastRow="0" w:noHBand="0" w:noVBand="1" w:val="04A0"/>
+      </w:tblPr>
+      <w:tblGrid>
+        <w:gridCol w:w="3312"/>
+        <w:gridCol w:w="3312"/>
+        <w:gridCol w:w="3312"/>
+      </w:tblGrid>
+      <w:tr>
+        <w:tc>
+          <w:tcPr>
+            <w:tcW w:type="dxa" w:w="2304"/>
+            <w:shd w:fill="DCE6F1"/>
+          </w:tcPr>
+          <w:p>
+            <w:r/>
+            <w:r>
+              <w:rPr>
+                <w:b/>
+                <w:sz w:val="18"/>
+              </w:rPr>
+              <w:t>Benefit</w:t>
+            </w:r>
+          </w:p>
+        </w:tc>
+        <w:tc>
+          <w:tcPr>
+            <w:tcW w:type="dxa" w:w="4320"/>
+            <w:shd w:fill="DCE6F1"/>
+          </w:tcPr>
+          <w:p>
+            <w:r/>
+            <w:r>
+              <w:rPr>
+                <w:b/>
+                <w:sz w:val="18"/>
+              </w:rPr>
+              <w:t>Mechanism in this platform</w:t>
+            </w:r>
+          </w:p>
+        </w:tc>
+        <w:tc>
+          <w:tcPr>
+            <w:tcW w:type="dxa" w:w="3312"/>
+            <w:shd w:fill="DCE6F1"/>
+          </w:tcPr>
+          <w:p>
+            <w:r/>
+            <w:r>
+              <w:rPr>
+                <w:b/>
+                <w:sz w:val="18"/>
+              </w:rPr>
+              <w:t>Where it shows up in operations</w:t>
+            </w:r>
+          </w:p>
+        </w:tc>
+      </w:tr>
+      <w:tr>
+        <w:tc>
+          <w:tcPr>
+            <w:tcW w:type="dxa" w:w="2304"/>
+          </w:tcPr>
+          <w:p>
+            <w:pPr>
+              <w:spacing w:after="40"/>
+            </w:pPr>
+            <w:r/>
+            <w:r>
+              <w:rPr>
+                <w:sz w:val="18"/>
+              </w:rPr>
+              <w:t>In-service issues found in hours, not weeks</w:t>
+            </w:r>
+          </w:p>
+        </w:tc>
+        <w:tc>
+          <w:tcPr>
+            <w:tcW w:type="dxa" w:w="4320"/>
+          </w:tcPr>
+          <w:p>
+            <w:pPr>
+              <w:spacing w:after="40"/>
+            </w:pPr>
+            <w:r/>
+            <w:r>
+              <w:rPr>
+                <w:sz w:val="18"/>
+              </w:rPr>
+              <w:t>Server-side detection from the message feed, ACMS reports and partition events, with the evidence attached</w:t>
+            </w:r>
+          </w:p>
+        </w:tc>
+        <w:tc>
+          <w:tcPr>
+            <w:tcW w:type="dxa" w:w="3312"/>
+          </w:tcPr>
+          <w:p>
+            <w:pPr>
+              <w:spacing w:after="40"/>
+            </w:pPr>
+            <w:r/>
+            <w:r>
+              <w:rPr>
+                <w:sz w:val="18"/>
+              </w:rPr>
+              <w:t>Engineering works a defect on the day it occurs, with the transaction in hand, instead of opening a ticket after the crew reports it</w:t>
+            </w:r>
+          </w:p>
+        </w:tc>
+      </w:tr>
+      <w:tr>
+        <w:tc>
+          <w:tcPr>
+            <w:tcW w:type="dxa" w:w="2304"/>
+          </w:tcPr>
+          <w:p>
+            <w:pPr>
+              <w:spacing w:after="40"/>
+            </w:pPr>
+            <w:r/>
+            <w:r>
+              <w:rPr>
+                <w:sz w:val="18"/>
+              </w:rPr>
+              <w:t>Fewer no-fault-found removals and bench-test-goods</w:t>
+            </w:r>
+          </w:p>
+        </w:tc>
+        <w:tc>
+          <w:tcPr>
+            <w:tcW w:type="dxa" w:w="4320"/>
+          </w:tcPr>
+          <w:p>
+            <w:pPr>
+              <w:spacing w:after="40"/>
+            </w:pPr>
+            <w:r/>
+            <w:r>
+              <w:rPr>
+                <w:sz w:val="18"/>
+              </w:rPr>
+              <w:t>The evidence pack that travels with the removal states the requirement, the measured value, the margin and the configuration, so the shop reproduces the conditions</w:t>
+            </w:r>
+          </w:p>
+        </w:tc>
+        <w:tc>
+          <w:tcPr>
+            <w:tcW w:type="dxa" w:w="3312"/>
+          </w:tcPr>
+          <w:p>
+            <w:pPr>
+              <w:spacing w:after="40"/>
+            </w:pPr>
+            <w:r/>
+            <w:r>
+              <w:rPr>
+                <w:sz w:val="18"/>
+              </w:rPr>
+              <w:t>No-fault-found is typically one of the largest avoidable line-maintenance costs; every avoided removal avoids the labour, the logistics and a spare</w:t>
+            </w:r>
+          </w:p>
+        </w:tc>
+      </w:tr>
+      <w:tr>
+        <w:tc>
+          <w:tcPr>
+            <w:tcW w:type="dxa" w:w="2304"/>
+          </w:tcPr>
+          <w:p>
+            <w:pPr>
+              <w:spacing w:after="40"/>
+            </w:pPr>
+            <w:r/>
+            <w:r>
+              <w:rPr>
+                <w:sz w:val="18"/>
+              </w:rPr>
+              <w:t>Less engineering, audit and warranty effort</w:t>
+            </w:r>
+          </w:p>
+        </w:tc>
+        <w:tc>
+          <w:tcPr>
+            <w:tcW w:type="dxa" w:w="4320"/>
+          </w:tcPr>
+          <w:p>
+            <w:pPr>
+              <w:spacing w:after="40"/>
+            </w:pPr>
+            <w:r/>
+            <w:r>
+              <w:rPr>
+                <w:sz w:val="18"/>
+              </w:rPr>
+              <w:t>Conformance records, coverage accounting and evidence packages are produced by the pipeline</w:t>
+            </w:r>
+          </w:p>
+        </w:tc>
+        <w:tc>
+          <w:tcPr>
+            <w:tcW w:type="dxa" w:w="3312"/>
+          </w:tcPr>
+          <w:p>
+            <w:pPr>
+              <w:spacing w:after="40"/>
+            </w:pPr>
+            <w:r/>
+            <w:r>
+              <w:rPr>
+                <w:sz w:val="18"/>
+              </w:rPr>
+              <w:t>Reliability engineering time moves from collecting data to acting on it; warranty claims arrive evidence-backed rather than as goodwill swaps</w:t>
+            </w:r>
+          </w:p>
+        </w:tc>
+      </w:tr>
+      <w:tr>
+        <w:tc>
+          <w:tcPr>
+            <w:tcW w:type="dxa" w:w="2304"/>
+          </w:tcPr>
+          <w:p>
+            <w:pPr>
+              <w:spacing w:after="40"/>
+            </w:pPr>
+            <w:r/>
+            <w:r>
+              <w:rPr>
+                <w:sz w:val="18"/>
+              </w:rPr>
+              <w:t>Protected disruption risk (the reason airlines buy)</w:t>
+            </w:r>
+          </w:p>
+        </w:tc>
+        <w:tc>
+          <w:tcPr>
+            <w:tcW w:type="dxa" w:w="4320"/>
+          </w:tcPr>
+          <w:p>
+            <w:pPr>
+              <w:spacing w:after="40"/>
+            </w:pPr>
+            <w:r/>
+            <w:r>
+              <w:rPr>
+                <w:sz w:val="18"/>
+              </w:rPr>
+              <w:t>Early detection of degradation on the aircraft that is behind the fleet, before it fails in service</w:t>
+            </w:r>
+          </w:p>
+        </w:tc>
+        <w:tc>
+          <w:tcPr>
+            <w:tcW w:type="dxa" w:w="3312"/>
+          </w:tcPr>
+          <w:p>
+            <w:pPr>
+              <w:spacing w:after="40"/>
+            </w:pPr>
+            <w:r/>
+            <w:r>
+              <w:rPr>
+                <w:sz w:val="18"/>
+              </w:rPr>
+              <w:t>One avoided AOG or diversion typically costs less than years of subscription; the product is sold against the tail risk, not the average</w:t>
+            </w:r>
+          </w:p>
+        </w:tc>
+      </w:tr>
+      <w:tr>
+        <w:tc>
+          <w:tcPr>
+            <w:tcW w:type="dxa" w:w="2304"/>
+          </w:tcPr>
+          <w:p>
+            <w:pPr>
+              <w:spacing w:after="40"/>
+            </w:pPr>
+            <w:r/>
+            <w:r>
+              <w:rPr>
+                <w:sz w:val="18"/>
+              </w:rPr>
+              <w:t>Targeted upgrades and retrofits</w:t>
+            </w:r>
+          </w:p>
+        </w:tc>
+        <w:tc>
+          <w:tcPr>
+            <w:tcW w:type="dxa" w:w="4320"/>
+          </w:tcPr>
+          <w:p>
+            <w:pPr>
+              <w:spacing w:after="40"/>
+            </w:pPr>
+            <w:r/>
+            <w:r>
+              <w:rPr>
+                <w:sz w:val="18"/>
+              </w:rPr>
+              <w:t>Configuration drift is explicit: which tail, which software load, which database revision, which modem</w:t>
+            </w:r>
+          </w:p>
+        </w:tc>
+        <w:tc>
+          <w:tcPr>
+            <w:tcW w:type="dxa" w:w="3312"/>
+          </w:tcPr>
+          <w:p>
+            <w:pPr>
+              <w:spacing w:after="40"/>
+            </w:pPr>
+            <w:r/>
+            <w:r>
+              <w:rPr>
+                <w:sz w:val="18"/>
+              </w:rPr>
+              <w:t>A campaign reaches only the tails that need it, which is what makes it affordable and keeps aircraft in service</w:t>
+            </w:r>
+          </w:p>
+        </w:tc>
+      </w:tr>
+      <w:tr>
+        <w:tc>
+          <w:tcPr>
+            <w:tcW w:type="dxa" w:w="2304"/>
+          </w:tcPr>
+          <w:p>
+            <w:pPr>
+              <w:spacing w:after="40"/>
+            </w:pPr>
+            <w:r/>
+            <w:r>
+              <w:rPr>
+                <w:sz w:val="18"/>
+              </w:rPr>
+              <w:t>Route and airspace intelligence</w:t>
+            </w:r>
+          </w:p>
+        </w:tc>
+        <w:tc>
+          <w:tcPr>
+            <w:tcW w:type="dxa" w:w="4320"/>
+          </w:tcPr>
+          <w:p>
+            <w:pPr>
+              <w:spacing w:after="40"/>
+            </w:pPr>
+            <w:r/>
+            <w:r>
+              <w:rPr>
+                <w:sz w:val="18"/>
+              </w:rPr>
+              <w:t>Link, handover and noise-floor patterns localised by airspace and time window</w:t>
+            </w:r>
+          </w:p>
+        </w:tc>
+        <w:tc>
+          <w:tcPr>
+            <w:tcW w:type="dxa" w:w="3312"/>
+          </w:tcPr>
+          <w:p>
+            <w:pPr>
+              <w:spacing w:after="40"/>
+            </w:pPr>
+            <w:r/>
+            <w:r>
+              <w:rPr>
+                <w:sz w:val="18"/>
+              </w:rPr>
+              <w:t>Procurement, network planning and ANSP conversations get evidence instead of anecdote</w:t>
+            </w:r>
+          </w:p>
+        </w:tc>
+      </w:tr>
+    </w:tbl>
+    <w:p>
+      <w:pPr>
+        <w:spacing w:after="40"/>
+      </w:pPr>
+    </w:p>
+    <w:p>
+      <w:pPr>
+        <w:pStyle w:val="Heading2"/>
+      </w:pPr>
+      <w:r>
+        <w:t>8.3 Benefit to the OEM / supplier, for example Honeywell Aerospace</w:t>
+      </w:r>
+    </w:p>
+    <w:tbl>
+      <w:tblPr>
+        <w:tblStyle w:val="TableGrid"/>
+        <w:tblW w:type="auto" w:w="0"/>
+        <w:jc w:val="center"/>
+        <w:tblLook w:firstColumn="1" w:firstRow="1" w:lastColumn="0" w:lastRow="0" w:noHBand="0" w:noVBand="1" w:val="04A0"/>
+      </w:tblPr>
+      <w:tblGrid>
+        <w:gridCol w:w="3312"/>
+        <w:gridCol w:w="3312"/>
+        <w:gridCol w:w="3312"/>
+      </w:tblGrid>
+      <w:tr>
+        <w:tc>
+          <w:tcPr>
+            <w:tcW w:type="dxa" w:w="2304"/>
+            <w:shd w:fill="DCE6F1"/>
+          </w:tcPr>
+          <w:p>
+            <w:r/>
+            <w:r>
+              <w:rPr>
+                <w:b/>
+                <w:sz w:val="18"/>
+              </w:rPr>
+              <w:t>Benefit</w:t>
+            </w:r>
+          </w:p>
+        </w:tc>
+        <w:tc>
+          <w:tcPr>
+            <w:tcW w:type="dxa" w:w="4320"/>
+            <w:shd w:fill="DCE6F1"/>
+          </w:tcPr>
+          <w:p>
+            <w:r/>
+            <w:r>
+              <w:rPr>
+                <w:b/>
+                <w:sz w:val="18"/>
+              </w:rPr>
+              <w:t>Mechanism in this platform</w:t>
+            </w:r>
+          </w:p>
+        </w:tc>
+        <w:tc>
+          <w:tcPr>
+            <w:tcW w:type="dxa" w:w="3312"/>
+            <w:shd w:fill="DCE6F1"/>
+          </w:tcPr>
+          <w:p>
+            <w:r/>
+            <w:r>
+              <w:rPr>
+                <w:b/>
+                <w:sz w:val="18"/>
+              </w:rPr>
+              <w:t>Commercial consequence</w:t>
+            </w:r>
+          </w:p>
+        </w:tc>
+      </w:tr>
+      <w:tr>
+        <w:tc>
+          <w:tcPr>
+            <w:tcW w:type="dxa" w:w="2304"/>
+          </w:tcPr>
+          <w:p>
+            <w:pPr>
+              <w:spacing w:after="40"/>
+            </w:pPr>
+            <w:r/>
+            <w:r>
+              <w:rPr>
+                <w:sz w:val="18"/>
+              </w:rPr>
+              <w:t>In-service issues identified before the customer reports them</w:t>
+            </w:r>
+          </w:p>
+        </w:tc>
+        <w:tc>
+          <w:tcPr>
+            <w:tcW w:type="dxa" w:w="4320"/>
+          </w:tcPr>
+          <w:p>
+            <w:pPr>
+              <w:spacing w:after="40"/>
+            </w:pPr>
+            <w:r/>
+            <w:r>
+              <w:rPr>
+                <w:sz w:val="18"/>
+              </w:rPr>
+              <w:t>Fleet-wide patterns across tails and configurations, in days, with synchronised timestamps and raw evidence attached</w:t>
+            </w:r>
+          </w:p>
+        </w:tc>
+        <w:tc>
+          <w:tcPr>
+            <w:tcW w:type="dxa" w:w="3312"/>
+          </w:tcPr>
+          <w:p>
+            <w:pPr>
+              <w:spacing w:after="40"/>
+            </w:pPr>
+            <w:r/>
+            <w:r>
+              <w:rPr>
+                <w:sz w:val="18"/>
+              </w:rPr>
+              <w:t>Support and engineering are already looking at the problem when the customer first mentions it, which changes the conversation from defence to diagnosis</w:t>
+            </w:r>
+          </w:p>
+        </w:tc>
+      </w:tr>
+      <w:tr>
+        <w:tc>
+          <w:tcPr>
+            <w:tcW w:type="dxa" w:w="2304"/>
+          </w:tcPr>
+          <w:p>
+            <w:pPr>
+              <w:spacing w:after="40"/>
+            </w:pPr>
+            <w:r/>
+            <w:r>
+              <w:rPr>
+                <w:sz w:val="18"/>
+              </w:rPr>
+              <w:t>Warranty and no-fault-found cost reduced</w:t>
+            </w:r>
+          </w:p>
+        </w:tc>
+        <w:tc>
+          <w:tcPr>
+            <w:tcW w:type="dxa" w:w="4320"/>
+          </w:tcPr>
+          <w:p>
+            <w:pPr>
+              <w:spacing w:after="40"/>
+            </w:pPr>
+            <w:r/>
+            <w:r>
+              <w:rPr>
+                <w:sz w:val="18"/>
+              </w:rPr>
+              <w:t>A removal is attributed to a partition, a modem, a database revision, the radio or the crew — not to a part number alone</w:t>
+            </w:r>
+          </w:p>
+        </w:tc>
+        <w:tc>
+          <w:tcPr>
+            <w:tcW w:type="dxa" w:w="3312"/>
+          </w:tcPr>
+          <w:p>
+            <w:pPr>
+              <w:spacing w:after="40"/>
+            </w:pPr>
+            <w:r/>
+            <w:r>
+              <w:rPr>
+                <w:sz w:val="18"/>
+              </w:rPr>
+              <w:t>Warranty boards spend less on removals that test good; the credibility of a warranty decision improves because it is evidence-backed</w:t>
+            </w:r>
+          </w:p>
+        </w:tc>
+      </w:tr>
+      <w:tr>
+        <w:tc>
+          <w:tcPr>
+            <w:tcW w:type="dxa" w:w="2304"/>
+          </w:tcPr>
+          <w:p>
+            <w:pPr>
+              <w:spacing w:after="40"/>
+            </w:pPr>
+            <w:r/>
+            <w:r>
+              <w:rPr>
+                <w:sz w:val="18"/>
+              </w:rPr>
+              <w:t>Root cause bounded, exposure smaller</w:t>
+            </w:r>
+          </w:p>
+        </w:tc>
+        <w:tc>
+          <w:tcPr>
+            <w:tcW w:type="dxa" w:w="4320"/>
+          </w:tcPr>
+          <w:p>
+            <w:pPr>
+              <w:spacing w:after="40"/>
+            </w:pPr>
+            <w:r/>
+            <w:r>
+              <w:rPr>
+                <w:sz w:val="18"/>
+              </w:rPr>
+              <w:t>The affected population is identified by software load, hardware part number and database revision</w:t>
+            </w:r>
+          </w:p>
+        </w:tc>
+        <w:tc>
+          <w:tcPr>
+            <w:tcW w:type="dxa" w:w="3312"/>
+          </w:tcPr>
+          <w:p>
+            <w:pPr>
+              <w:spacing w:after="40"/>
+            </w:pPr>
+            <w:r/>
+            <w:r>
+              <w:rPr>
+                <w:sz w:val="18"/>
+              </w:rPr>
+              <w:t>A fix is limited to the affected configuration instead of being issued as a blanket service bulletin across the fleet</w:t>
+            </w:r>
+          </w:p>
+        </w:tc>
+      </w:tr>
+      <w:tr>
+        <w:tc>
+          <w:tcPr>
+            <w:tcW w:type="dxa" w:w="2304"/>
+          </w:tcPr>
+          <w:p>
+            <w:pPr>
+              <w:spacing w:after="40"/>
+            </w:pPr>
+            <w:r/>
+            <w:r>
+              <w:rPr>
+                <w:sz w:val="18"/>
+              </w:rPr>
+              <w:t>Support load deflected, campaigns targeted</w:t>
+            </w:r>
+          </w:p>
+        </w:tc>
+        <w:tc>
+          <w:tcPr>
+            <w:tcW w:type="dxa" w:w="4320"/>
+          </w:tcPr>
+          <w:p>
+            <w:pPr>
+              <w:spacing w:after="40"/>
+            </w:pPr>
+            <w:r/>
+            <w:r>
+              <w:rPr>
+                <w:sz w:val="18"/>
+              </w:rPr>
+              <w:t>A share of technical-support cases becomes platform-detected events with evidence; upgrades reach the right tails</w:t>
+            </w:r>
+          </w:p>
+        </w:tc>
+        <w:tc>
+          <w:tcPr>
+            <w:tcW w:type="dxa" w:w="3312"/>
+          </w:tcPr>
+          <w:p>
+            <w:pPr>
+              <w:spacing w:after="40"/>
+            </w:pPr>
+            <w:r/>
+            <w:r>
+              <w:rPr>
+                <w:sz w:val="18"/>
+              </w:rPr>
+              <w:t>Support capacity is released, and campaign cost per aircraft falls while compliance improves</w:t>
+            </w:r>
+          </w:p>
+        </w:tc>
+      </w:tr>
+      <w:tr>
+        <w:tc>
+          <w:tcPr>
+            <w:tcW w:type="dxa" w:w="2304"/>
+          </w:tcPr>
+          <w:p>
+            <w:pPr>
+              <w:spacing w:after="40"/>
+            </w:pPr>
+            <w:r/>
+            <w:r>
+              <w:rPr>
+                <w:sz w:val="18"/>
+              </w:rPr>
+              <w:t>A new revenue line on the same contract</w:t>
+            </w:r>
+          </w:p>
+        </w:tc>
+        <w:tc>
+          <w:tcPr>
+            <w:tcW w:type="dxa" w:w="4320"/>
+          </w:tcPr>
+          <w:p>
+            <w:pPr>
+              <w:spacing w:after="40"/>
+            </w:pPr>
+            <w:r/>
+            <w:r>
+              <w:rPr>
+                <w:sz w:val="18"/>
+              </w:rPr>
+              <w:t>Reliability intelligence is delivered alongside the existing maintenance and support agreement</w:t>
+            </w:r>
+          </w:p>
+        </w:tc>
+        <w:tc>
+          <w:tcPr>
+            <w:tcW w:type="dxa" w:w="3312"/>
+          </w:tcPr>
+          <w:p>
+            <w:pPr>
+              <w:spacing w:after="40"/>
+            </w:pPr>
+            <w:r/>
+            <w:r>
+              <w:rPr>
+                <w:sz w:val="18"/>
+              </w:rPr>
+              <w:t>A services line with high margin and no new hardware on the aircraft, and a data asset that grows with the installed base</w:t>
+            </w:r>
+          </w:p>
+        </w:tc>
+      </w:tr>
+      <w:tr>
+        <w:tc>
+          <w:tcPr>
+            <w:tcW w:type="dxa" w:w="2304"/>
+          </w:tcPr>
+          <w:p>
+            <w:pPr>
+              <w:spacing w:after="40"/>
+            </w:pPr>
+            <w:r/>
+            <w:r>
+              <w:rPr>
+                <w:sz w:val="18"/>
+              </w:rPr>
+              <w:t>Protection of the product reputation</w:t>
+            </w:r>
+          </w:p>
+        </w:tc>
+        <w:tc>
+          <w:tcPr>
+            <w:tcW w:type="dxa" w:w="4320"/>
+          </w:tcPr>
+          <w:p>
+            <w:pPr>
+              <w:spacing w:after="40"/>
+            </w:pPr>
+            <w:r/>
+            <w:r>
+              <w:rPr>
+                <w:sz w:val="18"/>
+              </w:rPr>
+              <w:t>A defect is found, explained and bounded by the OEM rather than discovered by an airline in public</w:t>
+            </w:r>
+          </w:p>
+        </w:tc>
+        <w:tc>
+          <w:tcPr>
+            <w:tcW w:type="dxa" w:w="3312"/>
+          </w:tcPr>
+          <w:p>
+            <w:pPr>
+              <w:spacing w:after="40"/>
+            </w:pPr>
+            <w:r/>
+            <w:r>
+              <w:rPr>
+                <w:sz w:val="18"/>
+              </w:rPr>
+              <w:t>In a segment where the customer talks to competitors, being first to find your own defect is worth more than the engineering cost of finding it</w:t>
+            </w:r>
+          </w:p>
+        </w:tc>
+      </w:tr>
+    </w:tbl>
+    <w:p>
+      <w:pPr>
+        <w:spacing w:after="40"/>
+      </w:pPr>
+    </w:p>
+    <w:p>
+      <w:pPr>
+        <w:sectPr>
+          <w:pgSz w:w="12240" w:h="15840"/>
+          <w:pgMar w:top="1008" w:right="1152" w:bottom="1008" w:left="1152" w:header="720" w:footer="720" w:gutter="0"/>
+          <w:cols w:space="720"/>
+          <w:docGrid w:linePitch="360"/>
+        </w:sectPr>
+      </w:pPr>
+    </w:p>
+    <w:p>
+      <w:pPr>
+        <w:spacing w:before="80" w:after="40"/>
+        <w:jc w:val="center"/>
+      </w:pPr>
+      <w:r>
+        <w:drawing>
+          <wp:inline xmlns:a="http://schemas.openxmlformats.org/drawingml/2006/main" xmlns:pic="http://schemas.openxmlformats.org/drawingml/2006/picture">
+            <wp:extent cx="8778240" cy="5316399"/>
+            <wp:docPr id="7" name="Picture 7"/>
+            <wp:cNvGraphicFramePr>
+              <a:graphicFrameLocks noChangeAspect="1"/>
+            </wp:cNvGraphicFramePr>
+            <a:graphic>
+              <a:graphicData uri="http://schemas.openxmlformats.org/drawingml/2006/picture">
+                <pic:pic>
+                  <pic:nvPicPr>
+                    <pic:cNvPr id="0" name="fig7_value_map.png"/>
+                    <pic:cNvPicPr/>
+                  </pic:nvPicPr>
+                  <pic:blipFill>
+                    <a:blip r:embed="rId15"/>
+                    <a:stretch>
+                      <a:fillRect/>
+                    </a:stretch>
+                  </pic:blipFill>
+                  <pic:spPr>
+                    <a:xfrm>
+                      <a:off x="0" y="0"/>
+                      <a:ext cx="8778240" cy="5316399"/>
+                    </a:xfrm>
+                    <a:prstGeom prst="rect"/>
+                  </pic:spPr>
+                </pic:pic>
+              </a:graphicData>
+            </a:graphic>
+          </wp:inline>
+        </w:drawing>
+      </w:r>
+    </w:p>
+    <w:p>
+      <w:pPr>
+        <w:spacing w:after="200"/>
+        <w:jc w:val="center"/>
+      </w:pPr>
+      <w:r>
+        <w:rPr>
+          <w:i/>
+          <w:color w:val="445566"/>
+          <w:sz w:val="17"/>
+        </w:rPr>
+        <w:t>Figure 7 — Who gains, what it is worth to each party, and what each side pays. All figures are indicative planning estimates for 2026–2028, to be validated by customer interviews (see 8.7–8.10).</w:t>
+      </w:r>
+    </w:p>
+    <w:p>
+      <w:pPr>
+        <w:sectPr>
+          <w:pgSz w:w="15840" w:h="12240" w:orient="landscape"/>
+          <w:pgMar w:top="720" w:right="792" w:bottom="720" w:left="792" w:header="720" w:footer="720" w:gutter="0"/>
+          <w:cols w:space="720"/>
+          <w:docGrid w:linePitch="360"/>
+        </w:sectPr>
+      </w:pPr>
+    </w:p>
+    <w:p>
+      <w:pPr>
+        <w:pStyle w:val="Heading2"/>
+      </w:pPr>
+      <w:r>
+        <w:t>8.4 Prediction of datalink product internal failure — the mechanism in detail</w:t>
+      </w:r>
+    </w:p>
+    <w:p>
+      <w:r>
+        <w:rPr>
+          <w:b w:val="0"/>
+          <w:i w:val="0"/>
+        </w:rPr>
+        <w:t>Prediction here means three concrete things, each of which the architecture already produces:</w:t>
+      </w:r>
+    </w:p>
+    <w:p>
+      <w:pPr>
+        <w:pStyle w:val="ListBullet"/>
+      </w:pPr>
+      <w:r>
+        <w:rPr>
+          <w:b/>
+        </w:rPr>
+        <w:t xml:space="preserve">Margin decay versus the acceptance criterion. </w:t>
+      </w:r>
+      <w:r>
+        <w:t>Every conformance verdict carries a margin. Tracking that margin per tail, per software load and per route, and detecting a change point, gives an alarm while the requirement is still conforming — the finding in Figure 6 (left), where the alarm is raised at flight 14 and the violation would otherwise have arrived around flight 25.</w:t>
+      </w:r>
+    </w:p>
+    <w:p>
+      <w:pPr>
+        <w:pStyle w:val="ListBullet"/>
+      </w:pPr>
+      <w:r>
+        <w:rPr>
+          <w:b/>
+        </w:rPr>
+        <w:t xml:space="preserve">Resource-exhaustion signatures. </w:t>
+      </w:r>
+      <w:r>
+        <w:t>Partition execution against budget, overruns inside transmit windows, jitter, queue depth and watchdog events are the leading indicators of host-platform degradation. Two overruns inside one transmit window are not yet a customer-visible failure; they are the signature that precedes it, and Section 6 shows them being captured in flight.</w:t>
+      </w:r>
+    </w:p>
+    <w:p>
+      <w:pPr>
+        <w:pStyle w:val="ListBullet"/>
+      </w:pPr>
+      <w:r>
+        <w:rPr>
+          <w:b/>
+        </w:rPr>
+        <w:t xml:space="preserve">Configuration-bounded failure populations. </w:t>
+      </w:r>
+      <w:r>
+        <w:t>The same measurement is conforming on one software load and non-conforming on another. Attributing a pattern to a load, a modem or a database revision is what turns "the datalink is unreliable" into "this build misbehaves on this database, on these tails" — which is the statement an OEM can act on.</w:t>
+      </w:r>
+    </w:p>
+    <w:p>
+      <w:r>
+        <w:rPr>
+          <w:b w:val="0"/>
+          <w:i w:val="0"/>
+        </w:rPr>
+        <w:t>The commercial point is that prediction here is not a model making a guess; it is a deterministic comparison against the requirement, with the model only proposing what to look at. That is why the output can be trusted by an engineering organisation, and why a prediction that proves wrong is itself recorded and fed back through the flywheel in Figure 5.</w:t>
+      </w:r>
+    </w:p>
+    <w:p>
+      <w:pPr>
+        <w:pStyle w:val="Heading2"/>
+      </w:pPr>
+      <w:r>
+        <w:t>8.5 Getting in front of the customer: what early detection is actually worth</w:t>
       </w:r>
     </w:p>
     <w:tbl>
@@ -12167,6 +13337,3661 @@
                 <w:b/>
                 <w:sz w:val="18"/>
               </w:rPr>
+              <w:t>Issue class</w:t>
+            </w:r>
+          </w:p>
+        </w:tc>
+        <w:tc>
+          <w:tcPr>
+            <w:tcW w:type="dxa" w:w="3312"/>
+            <w:shd w:fill="DCE6F1"/>
+          </w:tcPr>
+          <w:p>
+            <w:r/>
+            <w:r>
+              <w:rPr>
+                <w:b/>
+                <w:sz w:val="18"/>
+              </w:rPr>
+              <w:t>How the OEM hears about it today</w:t>
+            </w:r>
+          </w:p>
+        </w:tc>
+        <w:tc>
+          <w:tcPr>
+            <w:tcW w:type="dxa" w:w="3888"/>
+            <w:shd w:fill="DCE6F1"/>
+          </w:tcPr>
+          <w:p>
+            <w:r/>
+            <w:r>
+              <w:rPr>
+                <w:b/>
+                <w:sz w:val="18"/>
+              </w:rPr>
+              <w:t>How this platform surfaces it</w:t>
+            </w:r>
+          </w:p>
+        </w:tc>
+        <w:tc>
+          <w:tcPr>
+            <w:tcW w:type="dxa" w:w="1296"/>
+            <w:shd w:fill="DCE6F1"/>
+          </w:tcPr>
+          <w:p>
+            <w:r/>
+            <w:r>
+              <w:rPr>
+                <w:b/>
+                <w:sz w:val="18"/>
+              </w:rPr>
+              <w:t>Typical lead time gained</w:t>
+            </w:r>
+          </w:p>
+        </w:tc>
+      </w:tr>
+      <w:tr>
+        <w:tc>
+          <w:tcPr>
+            <w:tcW w:type="dxa" w:w="2160"/>
+          </w:tcPr>
+          <w:p>
+            <w:pPr>
+              <w:spacing w:after="40"/>
+            </w:pPr>
+            <w:r/>
+            <w:r>
+              <w:rPr>
+                <w:sz w:val="18"/>
+              </w:rPr>
+              <w:t>Intermittent message loss on one software load</w:t>
+            </w:r>
+          </w:p>
+        </w:tc>
+        <w:tc>
+          <w:tcPr>
+            <w:tcW w:type="dxa" w:w="3312"/>
+          </w:tcPr>
+          <w:p>
+            <w:pPr>
+              <w:spacing w:after="40"/>
+            </w:pPr>
+            <w:r/>
+            <w:r>
+              <w:rPr>
+                <w:sz w:val="18"/>
+              </w:rPr>
+              <w:t>Support tickets and field reports, weeks to months after the first occurrence</w:t>
+            </w:r>
+          </w:p>
+        </w:tc>
+        <w:tc>
+          <w:tcPr>
+            <w:tcW w:type="dxa" w:w="3888"/>
+          </w:tcPr>
+          <w:p>
+            <w:pPr>
+              <w:spacing w:after="40"/>
+            </w:pPr>
+            <w:r/>
+            <w:r>
+              <w:rPr>
+                <w:sz w:val="18"/>
+              </w:rPr>
+              <w:t>Loss-burst pattern on one load across several tails, within days; the affected transactions are attached</w:t>
+            </w:r>
+          </w:p>
+        </w:tc>
+        <w:tc>
+          <w:tcPr>
+            <w:tcW w:type="dxa" w:w="1296"/>
+          </w:tcPr>
+          <w:p>
+            <w:pPr>
+              <w:spacing w:after="40"/>
+            </w:pPr>
+            <w:r/>
+            <w:r>
+              <w:rPr>
+                <w:sz w:val="18"/>
+              </w:rPr>
+              <w:t>Weeks to months</w:t>
+            </w:r>
+          </w:p>
+        </w:tc>
+      </w:tr>
+      <w:tr>
+        <w:tc>
+          <w:tcPr>
+            <w:tcW w:type="dxa" w:w="2160"/>
+          </w:tcPr>
+          <w:p>
+            <w:pPr>
+              <w:spacing w:after="40"/>
+            </w:pPr>
+            <w:r/>
+            <w:r>
+              <w:rPr>
+                <w:sz w:val="18"/>
+              </w:rPr>
+              <w:t>Partition overrun / resource exhaustion</w:t>
+            </w:r>
+          </w:p>
+        </w:tc>
+        <w:tc>
+          <w:tcPr>
+            <w:tcW w:type="dxa" w:w="3312"/>
+          </w:tcPr>
+          <w:p>
+            <w:pPr>
+              <w:spacing w:after="40"/>
+            </w:pPr>
+            <w:r/>
+            <w:r>
+              <w:rPr>
+                <w:sz w:val="18"/>
+              </w:rPr>
+              <w:t>Usually after a customer-visible failure, sometimes after an AOG</w:t>
+            </w:r>
+          </w:p>
+        </w:tc>
+        <w:tc>
+          <w:tcPr>
+            <w:tcW w:type="dxa" w:w="3888"/>
+          </w:tcPr>
+          <w:p>
+            <w:pPr>
+              <w:spacing w:after="40"/>
+            </w:pPr>
+            <w:r/>
+            <w:r>
+              <w:rPr>
+                <w:sz w:val="18"/>
+              </w:rPr>
+              <w:t>Overrun trend against the partition budget, in flight, with the transmit-window correlation</w:t>
+            </w:r>
+          </w:p>
+        </w:tc>
+        <w:tc>
+          <w:tcPr>
+            <w:tcW w:type="dxa" w:w="1296"/>
+          </w:tcPr>
+          <w:p>
+            <w:pPr>
+              <w:spacing w:after="40"/>
+            </w:pPr>
+            <w:r/>
+            <w:r>
+              <w:rPr>
+                <w:sz w:val="18"/>
+              </w:rPr>
+              <w:t>Weeks</w:t>
+            </w:r>
+          </w:p>
+        </w:tc>
+      </w:tr>
+      <w:tr>
+        <w:tc>
+          <w:tcPr>
+            <w:tcW w:type="dxa" w:w="2160"/>
+          </w:tcPr>
+          <w:p>
+            <w:pPr>
+              <w:spacing w:after="40"/>
+            </w:pPr>
+            <w:r/>
+            <w:r>
+              <w:rPr>
+                <w:sz w:val="18"/>
+              </w:rPr>
+              <w:t>Modem or database interaction defect</w:t>
+            </w:r>
+          </w:p>
+        </w:tc>
+        <w:tc>
+          <w:tcPr>
+            <w:tcW w:type="dxa" w:w="3312"/>
+          </w:tcPr>
+          <w:p>
+            <w:pPr>
+              <w:spacing w:after="40"/>
+            </w:pPr>
+            <w:r/>
+            <w:r>
+              <w:rPr>
+                <w:sz w:val="18"/>
+              </w:rPr>
+              <w:t>Discovered when a specific combination misbehaves, then reconstructed by hand</w:t>
+            </w:r>
+          </w:p>
+        </w:tc>
+        <w:tc>
+          <w:tcPr>
+            <w:tcW w:type="dxa" w:w="3888"/>
+          </w:tcPr>
+          <w:p>
+            <w:pPr>
+              <w:spacing w:after="40"/>
+            </w:pPr>
+            <w:r/>
+            <w:r>
+              <w:rPr>
+                <w:sz w:val="18"/>
+              </w:rPr>
+              <w:t>Configuration-drift correlation: which tails moved to the new database and what changed in their verdicts</w:t>
+            </w:r>
+          </w:p>
+        </w:tc>
+        <w:tc>
+          <w:tcPr>
+            <w:tcW w:type="dxa" w:w="1296"/>
+          </w:tcPr>
+          <w:p>
+            <w:pPr>
+              <w:spacing w:after="40"/>
+            </w:pPr>
+            <w:r/>
+            <w:r>
+              <w:rPr>
+                <w:sz w:val="18"/>
+              </w:rPr>
+              <w:t>Weeks</w:t>
+            </w:r>
+          </w:p>
+        </w:tc>
+      </w:tr>
+      <w:tr>
+        <w:tc>
+          <w:tcPr>
+            <w:tcW w:type="dxa" w:w="2160"/>
+          </w:tcPr>
+          <w:p>
+            <w:pPr>
+              <w:spacing w:after="40"/>
+            </w:pPr>
+            <w:r/>
+            <w:r>
+              <w:rPr>
+                <w:sz w:val="18"/>
+              </w:rPr>
+              <w:t>Subnetwork handover failures</w:t>
+            </w:r>
+          </w:p>
+        </w:tc>
+        <w:tc>
+          <w:tcPr>
+            <w:tcW w:type="dxa" w:w="3312"/>
+          </w:tcPr>
+          <w:p>
+            <w:pPr>
+              <w:spacing w:after="40"/>
+            </w:pPr>
+            <w:r/>
+            <w:r>
+              <w:rPr>
+                <w:sz w:val="18"/>
+              </w:rPr>
+              <w:t>ANSP tickets and anecdote, aggregated by nobody</w:t>
+            </w:r>
+          </w:p>
+        </w:tc>
+        <w:tc>
+          <w:tcPr>
+            <w:tcW w:type="dxa" w:w="3888"/>
+          </w:tcPr>
+          <w:p>
+            <w:pPr>
+              <w:spacing w:after="40"/>
+            </w:pPr>
+            <w:r/>
+            <w:r>
+              <w:rPr>
+                <w:sz w:val="18"/>
+              </w:rPr>
+              <w:t>Handover-failure clustering by airspace and time window, counted and attributed</w:t>
+            </w:r>
+          </w:p>
+        </w:tc>
+        <w:tc>
+          <w:tcPr>
+            <w:tcW w:type="dxa" w:w="1296"/>
+          </w:tcPr>
+          <w:p>
+            <w:pPr>
+              <w:spacing w:after="40"/>
+            </w:pPr>
+            <w:r/>
+            <w:r>
+              <w:rPr>
+                <w:sz w:val="18"/>
+              </w:rPr>
+              <w:t>Weeks</w:t>
+            </w:r>
+          </w:p>
+        </w:tc>
+      </w:tr>
+      <w:tr>
+        <w:tc>
+          <w:tcPr>
+            <w:tcW w:type="dxa" w:w="2160"/>
+          </w:tcPr>
+          <w:p>
+            <w:pPr>
+              <w:spacing w:after="40"/>
+            </w:pPr>
+            <w:r/>
+            <w:r>
+              <w:rPr>
+                <w:sz w:val="18"/>
+              </w:rPr>
+              <w:t>Interference blamed on the product</w:t>
+            </w:r>
+          </w:p>
+        </w:tc>
+        <w:tc>
+          <w:tcPr>
+            <w:tcW w:type="dxa" w:w="3312"/>
+          </w:tcPr>
+          <w:p>
+            <w:pPr>
+              <w:spacing w:after="40"/>
+            </w:pPr>
+            <w:r/>
+            <w:r>
+              <w:rPr>
+                <w:sz w:val="18"/>
+              </w:rPr>
+              <w:t>Often attributed to the avionics first because nothing else is visible</w:t>
+            </w:r>
+          </w:p>
+        </w:tc>
+        <w:tc>
+          <w:tcPr>
+            <w:tcW w:type="dxa" w:w="3888"/>
+          </w:tcPr>
+          <w:p>
+            <w:pPr>
+              <w:spacing w:after="40"/>
+            </w:pPr>
+            <w:r/>
+            <w:r>
+              <w:rPr>
+                <w:sz w:val="18"/>
+              </w:rPr>
+              <w:t>Own-receiver noise-floor baseline and independent RF observations, which move the attribution off the product</w:t>
+            </w:r>
+          </w:p>
+        </w:tc>
+        <w:tc>
+          <w:tcPr>
+            <w:tcW w:type="dxa" w:w="1296"/>
+          </w:tcPr>
+          <w:p>
+            <w:pPr>
+              <w:spacing w:after="40"/>
+            </w:pPr>
+            <w:r/>
+            <w:r>
+              <w:rPr>
+                <w:sz w:val="18"/>
+              </w:rPr>
+              <w:t>Immediate to days, and it protects warranty spend</w:t>
+            </w:r>
+          </w:p>
+        </w:tc>
+      </w:tr>
+      <w:tr>
+        <w:tc>
+          <w:tcPr>
+            <w:tcW w:type="dxa" w:w="2160"/>
+          </w:tcPr>
+          <w:p>
+            <w:pPr>
+              <w:spacing w:after="40"/>
+            </w:pPr>
+            <w:r/>
+            <w:r>
+              <w:rPr>
+                <w:sz w:val="18"/>
+              </w:rPr>
+              <w:t>Requirements no longer exercised in service</w:t>
+            </w:r>
+          </w:p>
+        </w:tc>
+        <w:tc>
+          <w:tcPr>
+            <w:tcW w:type="dxa" w:w="3312"/>
+          </w:tcPr>
+          <w:p>
+            <w:pPr>
+              <w:spacing w:after="40"/>
+            </w:pPr>
+            <w:r/>
+            <w:r>
+              <w:rPr>
+                <w:sz w:val="18"/>
+              </w:rPr>
+              <w:t>Not visible at all today; nobody tracks it</w:t>
+            </w:r>
+          </w:p>
+        </w:tc>
+        <w:tc>
+          <w:tcPr>
+            <w:tcW w:type="dxa" w:w="3888"/>
+          </w:tcPr>
+          <w:p>
+            <w:pPr>
+              <w:spacing w:after="40"/>
+            </w:pPr>
+            <w:r/>
+            <w:r>
+              <w:rPr>
+                <w:sz w:val="18"/>
+              </w:rPr>
+              <w:t>Operational coverage account, continuous, by route and software load</w:t>
+            </w:r>
+          </w:p>
+        </w:tc>
+        <w:tc>
+          <w:tcPr>
+            <w:tcW w:type="dxa" w:w="1296"/>
+          </w:tcPr>
+          <w:p>
+            <w:pPr>
+              <w:spacing w:after="40"/>
+            </w:pPr>
+            <w:r/>
+            <w:r>
+              <w:rPr>
+                <w:sz w:val="18"/>
+              </w:rPr>
+              <w:t>A capability that does not exist today</w:t>
+            </w:r>
+          </w:p>
+        </w:tc>
+      </w:tr>
+    </w:tbl>
+    <w:p>
+      <w:pPr>
+        <w:spacing w:after="40"/>
+      </w:pPr>
+    </w:p>
+    <w:p>
+      <w:pPr>
+        <w:pStyle w:val="Heading2"/>
+      </w:pPr>
+      <w:r>
+        <w:t>8.6 How the benefits are proved (and why this matters for the sale)</w:t>
+      </w:r>
+    </w:p>
+    <w:p>
+      <w:r>
+        <w:rPr>
+          <w:b w:val="0"/>
+          <w:i w:val="0"/>
+        </w:rPr>
+        <w:t>Every benefit line above is measurable, and the pilot should be bought against measurements, not promises. The platform produces its own baseline because it records why each verdict changed.</w:t>
+      </w:r>
+    </w:p>
+    <w:tbl>
+      <w:tblPr>
+        <w:tblStyle w:val="TableGrid"/>
+        <w:tblW w:type="auto" w:w="0"/>
+        <w:jc w:val="center"/>
+        <w:tblLook w:firstColumn="1" w:firstRow="1" w:lastColumn="0" w:lastRow="0" w:noHBand="0" w:noVBand="1" w:val="04A0"/>
+      </w:tblPr>
+      <w:tblGrid>
+        <w:gridCol w:w="3312"/>
+        <w:gridCol w:w="3312"/>
+        <w:gridCol w:w="3312"/>
+      </w:tblGrid>
+      <w:tr>
+        <w:tc>
+          <w:tcPr>
+            <w:tcW w:type="dxa" w:w="4032"/>
+            <w:shd w:fill="DCE6F1"/>
+          </w:tcPr>
+          <w:p>
+            <w:r/>
+            <w:r>
+              <w:rPr>
+                <w:b/>
+                <w:sz w:val="18"/>
+              </w:rPr>
+              <w:t>Metric</w:t>
+            </w:r>
+          </w:p>
+        </w:tc>
+        <w:tc>
+          <w:tcPr>
+            <w:tcW w:type="dxa" w:w="2880"/>
+            <w:shd w:fill="DCE6F1"/>
+          </w:tcPr>
+          <w:p>
+            <w:r/>
+            <w:r>
+              <w:rPr>
+                <w:b/>
+                <w:sz w:val="18"/>
+              </w:rPr>
+              <w:t>Baseline: measure in week 1 of the pilot</w:t>
+            </w:r>
+          </w:p>
+        </w:tc>
+        <w:tc>
+          <w:tcPr>
+            <w:tcW w:type="dxa" w:w="3024"/>
+            <w:shd w:fill="DCE6F1"/>
+          </w:tcPr>
+          <w:p>
+            <w:r/>
+            <w:r>
+              <w:rPr>
+                <w:b/>
+                <w:sz w:val="18"/>
+              </w:rPr>
+              <w:t>Target by month 6</w:t>
+            </w:r>
+          </w:p>
+        </w:tc>
+      </w:tr>
+      <w:tr>
+        <w:tc>
+          <w:tcPr>
+            <w:tcW w:type="dxa" w:w="4032"/>
+          </w:tcPr>
+          <w:p>
+            <w:pPr>
+              <w:spacing w:after="40"/>
+            </w:pPr>
+            <w:r/>
+            <w:r>
+              <w:rPr>
+                <w:sz w:val="18"/>
+              </w:rPr>
+              <w:t>Share of comms issues detected by the platform before any crew, OCC or customer report</w:t>
+            </w:r>
+          </w:p>
+        </w:tc>
+        <w:tc>
+          <w:tcPr>
+            <w:tcW w:type="dxa" w:w="2880"/>
+          </w:tcPr>
+          <w:p>
+            <w:pPr>
+              <w:spacing w:after="40"/>
+            </w:pPr>
+            <w:r/>
+            <w:r>
+              <w:rPr>
+                <w:sz w:val="18"/>
+              </w:rPr>
+              <w:t>near zero today — this is the problem being sold</w:t>
+            </w:r>
+          </w:p>
+        </w:tc>
+        <w:tc>
+          <w:tcPr>
+            <w:tcW w:type="dxa" w:w="3024"/>
+          </w:tcPr>
+          <w:p>
+            <w:pPr>
+              <w:spacing w:after="40"/>
+            </w:pPr>
+            <w:r/>
+            <w:r>
+              <w:rPr>
+                <w:sz w:val="18"/>
+              </w:rPr>
+              <w:t>≥ 60 % of detected issues</w:t>
+            </w:r>
+          </w:p>
+        </w:tc>
+      </w:tr>
+      <w:tr>
+        <w:tc>
+          <w:tcPr>
+            <w:tcW w:type="dxa" w:w="4032"/>
+          </w:tcPr>
+          <w:p>
+            <w:pPr>
+              <w:spacing w:after="40"/>
+            </w:pPr>
+            <w:r/>
+            <w:r>
+              <w:rPr>
+                <w:sz w:val="18"/>
+              </w:rPr>
+              <w:t>Median time from occurrence to engineering-visible evidence</w:t>
+            </w:r>
+          </w:p>
+        </w:tc>
+        <w:tc>
+          <w:tcPr>
+            <w:tcW w:type="dxa" w:w="2880"/>
+          </w:tcPr>
+          <w:p>
+            <w:pPr>
+              <w:spacing w:after="40"/>
+            </w:pPr>
+            <w:r/>
+            <w:r>
+              <w:rPr>
+                <w:sz w:val="18"/>
+              </w:rPr>
+              <w:t>days to weeks</w:t>
+            </w:r>
+          </w:p>
+        </w:tc>
+        <w:tc>
+          <w:tcPr>
+            <w:tcW w:type="dxa" w:w="3024"/>
+          </w:tcPr>
+          <w:p>
+            <w:pPr>
+              <w:spacing w:after="40"/>
+            </w:pPr>
+            <w:r/>
+            <w:r>
+              <w:rPr>
+                <w:sz w:val="18"/>
+              </w:rPr>
+              <w:t>under 15 minutes for message-class requirements, under 1 hour for ACMS-class</w:t>
+            </w:r>
+          </w:p>
+        </w:tc>
+      </w:tr>
+      <w:tr>
+        <w:tc>
+          <w:tcPr>
+            <w:tcW w:type="dxa" w:w="4032"/>
+          </w:tcPr>
+          <w:p>
+            <w:pPr>
+              <w:spacing w:after="40"/>
+            </w:pPr>
+            <w:r/>
+            <w:r>
+              <w:rPr>
+                <w:sz w:val="18"/>
+              </w:rPr>
+              <w:t>No-fault-found rate on the monitored LRU</w:t>
+            </w:r>
+          </w:p>
+        </w:tc>
+        <w:tc>
+          <w:tcPr>
+            <w:tcW w:type="dxa" w:w="2880"/>
+          </w:tcPr>
+          <w:p>
+            <w:pPr>
+              <w:spacing w:after="40"/>
+            </w:pPr>
+            <w:r/>
+            <w:r>
+              <w:rPr>
+                <w:sz w:val="18"/>
+              </w:rPr>
+              <w:t>current shop rate</w:t>
+            </w:r>
+          </w:p>
+        </w:tc>
+        <w:tc>
+          <w:tcPr>
+            <w:tcW w:type="dxa" w:w="3024"/>
+          </w:tcPr>
+          <w:p>
+            <w:pPr>
+              <w:spacing w:after="40"/>
+            </w:pPr>
+            <w:r/>
+            <w:r>
+              <w:rPr>
+                <w:sz w:val="18"/>
+              </w:rPr>
+              <w:t>20 % relative reduction</w:t>
+            </w:r>
+          </w:p>
+        </w:tc>
+      </w:tr>
+      <w:tr>
+        <w:tc>
+          <w:tcPr>
+            <w:tcW w:type="dxa" w:w="4032"/>
+          </w:tcPr>
+          <w:p>
+            <w:pPr>
+              <w:spacing w:after="40"/>
+            </w:pPr>
+            <w:r/>
+            <w:r>
+              <w:rPr>
+                <w:sz w:val="18"/>
+              </w:rPr>
+              <w:t>Repeat faults, same requirement and same tail within 30 days</w:t>
+            </w:r>
+          </w:p>
+        </w:tc>
+        <w:tc>
+          <w:tcPr>
+            <w:tcW w:type="dxa" w:w="2880"/>
+          </w:tcPr>
+          <w:p>
+            <w:pPr>
+              <w:spacing w:after="40"/>
+            </w:pPr>
+            <w:r/>
+            <w:r>
+              <w:rPr>
+                <w:sz w:val="18"/>
+              </w:rPr>
+              <w:t>current rate</w:t>
+            </w:r>
+          </w:p>
+        </w:tc>
+        <w:tc>
+          <w:tcPr>
+            <w:tcW w:type="dxa" w:w="3024"/>
+          </w:tcPr>
+          <w:p>
+            <w:pPr>
+              <w:spacing w:after="40"/>
+            </w:pPr>
+            <w:r/>
+            <w:r>
+              <w:rPr>
+                <w:sz w:val="18"/>
+              </w:rPr>
+              <w:t>30 % relative reduction</w:t>
+            </w:r>
+          </w:p>
+        </w:tc>
+      </w:tr>
+      <w:tr>
+        <w:tc>
+          <w:tcPr>
+            <w:tcW w:type="dxa" w:w="4032"/>
+          </w:tcPr>
+          <w:p>
+            <w:pPr>
+              <w:spacing w:after="40"/>
+            </w:pPr>
+            <w:r/>
+            <w:r>
+              <w:rPr>
+                <w:sz w:val="18"/>
+              </w:rPr>
+              <w:t>Support cases raised by the airline on the monitored system</w:t>
+            </w:r>
+          </w:p>
+        </w:tc>
+        <w:tc>
+          <w:tcPr>
+            <w:tcW w:type="dxa" w:w="2880"/>
+          </w:tcPr>
+          <w:p>
+            <w:pPr>
+              <w:spacing w:after="40"/>
+            </w:pPr>
+            <w:r/>
+            <w:r>
+              <w:rPr>
+                <w:sz w:val="18"/>
+              </w:rPr>
+              <w:t>current volume</w:t>
+            </w:r>
+          </w:p>
+        </w:tc>
+        <w:tc>
+          <w:tcPr>
+            <w:tcW w:type="dxa" w:w="3024"/>
+          </w:tcPr>
+          <w:p>
+            <w:pPr>
+              <w:spacing w:after="40"/>
+            </w:pPr>
+            <w:r/>
+            <w:r>
+              <w:rPr>
+                <w:sz w:val="18"/>
+              </w:rPr>
+              <w:t>20 % relative reduction</w:t>
+            </w:r>
+          </w:p>
+        </w:tc>
+      </w:tr>
+      <w:tr>
+        <w:tc>
+          <w:tcPr>
+            <w:tcW w:type="dxa" w:w="4032"/>
+          </w:tcPr>
+          <w:p>
+            <w:pPr>
+              <w:spacing w:after="40"/>
+            </w:pPr>
+            <w:r/>
+            <w:r>
+              <w:rPr>
+                <w:sz w:val="18"/>
+              </w:rPr>
+              <w:t>Requirements with an evidence-complete, ledgered record per flight</w:t>
+            </w:r>
+          </w:p>
+        </w:tc>
+        <w:tc>
+          <w:tcPr>
+            <w:tcW w:type="dxa" w:w="2880"/>
+          </w:tcPr>
+          <w:p>
+            <w:pPr>
+              <w:spacing w:after="40"/>
+            </w:pPr>
+            <w:r/>
+            <w:r>
+              <w:rPr>
+                <w:sz w:val="18"/>
+              </w:rPr>
+              <w:t>effectively 0 of 128</w:t>
+            </w:r>
+          </w:p>
+        </w:tc>
+        <w:tc>
+          <w:tcPr>
+            <w:tcW w:type="dxa" w:w="3024"/>
+          </w:tcPr>
+          <w:p>
+            <w:pPr>
+              <w:spacing w:after="40"/>
+            </w:pPr>
+            <w:r/>
+            <w:r>
+              <w:rPr>
+                <w:sz w:val="18"/>
+              </w:rPr>
+              <w:t>≥ 90 % of in-scope requirements</w:t>
+            </w:r>
+          </w:p>
+        </w:tc>
+      </w:tr>
+      <w:tr>
+        <w:tc>
+          <w:tcPr>
+            <w:tcW w:type="dxa" w:w="4032"/>
+          </w:tcPr>
+          <w:p>
+            <w:pPr>
+              <w:spacing w:after="40"/>
+            </w:pPr>
+            <w:r/>
+            <w:r>
+              <w:rPr>
+                <w:sz w:val="18"/>
+              </w:rPr>
+              <w:t>OEM: mean time to root cause on a fleet-reported issue</w:t>
+            </w:r>
+          </w:p>
+        </w:tc>
+        <w:tc>
+          <w:tcPr>
+            <w:tcW w:type="dxa" w:w="2880"/>
+          </w:tcPr>
+          <w:p>
+            <w:pPr>
+              <w:spacing w:after="40"/>
+            </w:pPr>
+            <w:r/>
+            <w:r>
+              <w:rPr>
+                <w:sz w:val="18"/>
+              </w:rPr>
+              <w:t>weeks</w:t>
+            </w:r>
+          </w:p>
+        </w:tc>
+        <w:tc>
+          <w:tcPr>
+            <w:tcW w:type="dxa" w:w="3024"/>
+          </w:tcPr>
+          <w:p>
+            <w:pPr>
+              <w:spacing w:after="40"/>
+            </w:pPr>
+            <w:r/>
+            <w:r>
+              <w:rPr>
+                <w:sz w:val="18"/>
+              </w:rPr>
+              <w:t>40 % relative reduction</w:t>
+            </w:r>
+          </w:p>
+        </w:tc>
+      </w:tr>
+      <w:tr>
+        <w:tc>
+          <w:tcPr>
+            <w:tcW w:type="dxa" w:w="4032"/>
+          </w:tcPr>
+          <w:p>
+            <w:pPr>
+              <w:spacing w:after="40"/>
+            </w:pPr>
+            <w:r/>
+            <w:r>
+              <w:rPr>
+                <w:sz w:val="18"/>
+              </w:rPr>
+              <w:t>Coverage account produced and accepted</w:t>
+            </w:r>
+          </w:p>
+        </w:tc>
+        <w:tc>
+          <w:tcPr>
+            <w:tcW w:type="dxa" w:w="2880"/>
+          </w:tcPr>
+          <w:p>
+            <w:pPr>
+              <w:spacing w:after="40"/>
+            </w:pPr>
+            <w:r/>
+            <w:r>
+              <w:rPr>
+                <w:sz w:val="18"/>
+              </w:rPr>
+              <w:t>does not exist</w:t>
+            </w:r>
+          </w:p>
+        </w:tc>
+        <w:tc>
+          <w:tcPr>
+            <w:tcW w:type="dxa" w:w="3024"/>
+          </w:tcPr>
+          <w:p>
+            <w:pPr>
+              <w:spacing w:after="40"/>
+            </w:pPr>
+            <w:r/>
+            <w:r>
+              <w:rPr>
+                <w:sz w:val="18"/>
+              </w:rPr>
+              <w:t>per route and software load, monthly</w:t>
+            </w:r>
+          </w:p>
+        </w:tc>
+      </w:tr>
+    </w:tbl>
+    <w:p>
+      <w:pPr>
+        <w:spacing w:after="40"/>
+      </w:pPr>
+    </w:p>
+    <w:p>
+      <w:r>
+        <w:rPr>
+          <w:b w:val="0"/>
+          <w:i/>
+        </w:rPr>
+        <w:t>If the pilot cannot move the first two rows, the product should not be sold. If it moves them, the commercial case below is arithmetic rather than ambition.</w:t>
+      </w:r>
+    </w:p>
+    <w:p>
+      <w:pPr>
+        <w:pStyle w:val="Heading2"/>
+      </w:pPr>
+      <w:r>
+        <w:t>8.7 What the benefits are worth in money (per 500-aircraft operator, per year)</w:t>
+      </w:r>
+    </w:p>
+    <w:tbl>
+      <w:tblPr>
+        <w:tblStyle w:val="TableGrid"/>
+        <w:tblW w:type="auto" w:w="0"/>
+        <w:jc w:val="center"/>
+        <w:tblLook w:firstColumn="1" w:firstRow="1" w:lastColumn="0" w:lastRow="0" w:noHBand="0" w:noVBand="1" w:val="04A0"/>
+      </w:tblPr>
+      <w:tblGrid>
+        <w:gridCol w:w="2484"/>
+        <w:gridCol w:w="2484"/>
+        <w:gridCol w:w="2484"/>
+        <w:gridCol w:w="2484"/>
+      </w:tblGrid>
+      <w:tr>
+        <w:tc>
+          <w:tcPr>
+            <w:tcW w:type="dxa" w:w="3456"/>
+            <w:shd w:fill="DCE6F1"/>
+          </w:tcPr>
+          <w:p>
+            <w:r/>
+            <w:r>
+              <w:rPr>
+                <w:b/>
+                <w:sz w:val="18"/>
+              </w:rPr>
+              <w:t>Benefit line</w:t>
+            </w:r>
+          </w:p>
+        </w:tc>
+        <w:tc>
+          <w:tcPr>
+            <w:tcW w:type="dxa" w:w="1584"/>
+            <w:shd w:fill="DCE6F1"/>
+          </w:tcPr>
+          <w:p>
+            <w:r/>
+            <w:r>
+              <w:rPr>
+                <w:b/>
+                <w:sz w:val="18"/>
+              </w:rPr>
+              <w:t>Conservative</w:t>
+            </w:r>
+          </w:p>
+        </w:tc>
+        <w:tc>
+          <w:tcPr>
+            <w:tcW w:type="dxa" w:w="1584"/>
+            <w:shd w:fill="DCE6F1"/>
+          </w:tcPr>
+          <w:p>
+            <w:r/>
+            <w:r>
+              <w:rPr>
+                <w:b/>
+                <w:sz w:val="18"/>
+              </w:rPr>
+              <w:t>Base case</w:t>
+            </w:r>
+          </w:p>
+        </w:tc>
+        <w:tc>
+          <w:tcPr>
+            <w:tcW w:type="dxa" w:w="3312"/>
+            <w:shd w:fill="DCE6F1"/>
+          </w:tcPr>
+          <w:p>
+            <w:r/>
+            <w:r>
+              <w:rPr>
+                <w:b/>
+                <w:sz w:val="18"/>
+              </w:rPr>
+              <w:t>Basis of the estimate</w:t>
+            </w:r>
+          </w:p>
+        </w:tc>
+      </w:tr>
+      <w:tr>
+        <w:tc>
+          <w:tcPr>
+            <w:tcW w:type="dxa" w:w="3456"/>
+          </w:tcPr>
+          <w:p>
+            <w:pPr>
+              <w:spacing w:after="40"/>
+            </w:pPr>
+            <w:r/>
+            <w:r>
+              <w:rPr>
+                <w:sz w:val="18"/>
+              </w:rPr>
+              <w:t>Avoided disruption and in-service detection value</w:t>
+            </w:r>
+          </w:p>
+        </w:tc>
+        <w:tc>
+          <w:tcPr>
+            <w:tcW w:type="dxa" w:w="1584"/>
+          </w:tcPr>
+          <w:p>
+            <w:pPr>
+              <w:spacing w:after="40"/>
+            </w:pPr>
+            <w:r/>
+            <w:r>
+              <w:rPr>
+                <w:sz w:val="18"/>
+              </w:rPr>
+              <w:t>USD 0.5 M</w:t>
+            </w:r>
+          </w:p>
+        </w:tc>
+        <w:tc>
+          <w:tcPr>
+            <w:tcW w:type="dxa" w:w="1584"/>
+          </w:tcPr>
+          <w:p>
+            <w:pPr>
+              <w:spacing w:after="40"/>
+            </w:pPr>
+            <w:r/>
+            <w:r>
+              <w:rPr>
+                <w:sz w:val="18"/>
+              </w:rPr>
+              <w:t>USD 2.0 M</w:t>
+            </w:r>
+          </w:p>
+        </w:tc>
+        <w:tc>
+          <w:tcPr>
+            <w:tcW w:type="dxa" w:w="3312"/>
+          </w:tcPr>
+          <w:p>
+            <w:pPr>
+              <w:spacing w:after="40"/>
+            </w:pPr>
+            <w:r/>
+            <w:r>
+              <w:rPr>
+                <w:sz w:val="18"/>
+              </w:rPr>
+              <w:t>A few avoided delays, diversions or cancellations attributable to comms, plus the engineering time saved by evidence arriving with the fault instead of after it</w:t>
+            </w:r>
+          </w:p>
+        </w:tc>
+      </w:tr>
+      <w:tr>
+        <w:tc>
+          <w:tcPr>
+            <w:tcW w:type="dxa" w:w="3456"/>
+          </w:tcPr>
+          <w:p>
+            <w:pPr>
+              <w:spacing w:after="40"/>
+            </w:pPr>
+            <w:r/>
+            <w:r>
+              <w:rPr>
+                <w:sz w:val="18"/>
+              </w:rPr>
+              <w:t>No-fault-found removals avoided</w:t>
+            </w:r>
+          </w:p>
+        </w:tc>
+        <w:tc>
+          <w:tcPr>
+            <w:tcW w:type="dxa" w:w="1584"/>
+          </w:tcPr>
+          <w:p>
+            <w:pPr>
+              <w:spacing w:after="40"/>
+            </w:pPr>
+            <w:r/>
+            <w:r>
+              <w:rPr>
+                <w:sz w:val="18"/>
+              </w:rPr>
+              <w:t>USD 0.3 M</w:t>
+            </w:r>
+          </w:p>
+        </w:tc>
+        <w:tc>
+          <w:tcPr>
+            <w:tcW w:type="dxa" w:w="1584"/>
+          </w:tcPr>
+          <w:p>
+            <w:pPr>
+              <w:spacing w:after="40"/>
+            </w:pPr>
+            <w:r/>
+            <w:r>
+              <w:rPr>
+                <w:sz w:val="18"/>
+              </w:rPr>
+              <w:t>USD 1.2 M</w:t>
+            </w:r>
+          </w:p>
+        </w:tc>
+        <w:tc>
+          <w:tcPr>
+            <w:tcW w:type="dxa" w:w="3312"/>
+          </w:tcPr>
+          <w:p>
+            <w:pPr>
+              <w:spacing w:after="40"/>
+            </w:pPr>
+            <w:r/>
+            <w:r>
+              <w:rPr>
+                <w:sz w:val="18"/>
+              </w:rPr>
+              <w:t>20–30 % of removals test good; a removal and refit cycle with logistics and a spare typically costs USD 5,000–15,000, and 20–40 removals a year per 500-tail fleet are plausible</w:t>
+            </w:r>
+          </w:p>
+        </w:tc>
+      </w:tr>
+      <w:tr>
+        <w:tc>
+          <w:tcPr>
+            <w:tcW w:type="dxa" w:w="3456"/>
+          </w:tcPr>
+          <w:p>
+            <w:pPr>
+              <w:spacing w:after="40"/>
+            </w:pPr>
+            <w:r/>
+            <w:r>
+              <w:rPr>
+                <w:sz w:val="18"/>
+              </w:rPr>
+              <w:t>Engineering, audit and warranty effort saved</w:t>
+            </w:r>
+          </w:p>
+        </w:tc>
+        <w:tc>
+          <w:tcPr>
+            <w:tcW w:type="dxa" w:w="1584"/>
+          </w:tcPr>
+          <w:p>
+            <w:pPr>
+              <w:spacing w:after="40"/>
+            </w:pPr>
+            <w:r/>
+            <w:r>
+              <w:rPr>
+                <w:sz w:val="18"/>
+              </w:rPr>
+              <w:t>USD 0.2 M</w:t>
+            </w:r>
+          </w:p>
+        </w:tc>
+        <w:tc>
+          <w:tcPr>
+            <w:tcW w:type="dxa" w:w="1584"/>
+          </w:tcPr>
+          <w:p>
+            <w:pPr>
+              <w:spacing w:after="40"/>
+            </w:pPr>
+            <w:r/>
+            <w:r>
+              <w:rPr>
+                <w:sz w:val="18"/>
+              </w:rPr>
+              <w:t>USD 0.6 M</w:t>
+            </w:r>
+          </w:p>
+        </w:tc>
+        <w:tc>
+          <w:tcPr>
+            <w:tcW w:type="dxa" w:w="3312"/>
+          </w:tcPr>
+          <w:p>
+            <w:pPr>
+              <w:spacing w:after="40"/>
+            </w:pPr>
+            <w:r/>
+            <w:r>
+              <w:rPr>
+                <w:sz w:val="18"/>
+              </w:rPr>
+              <w:t>Two to four full-time equivalents moved from data collection and claim assembly to engineering work</w:t>
+            </w:r>
+          </w:p>
+        </w:tc>
+      </w:tr>
+      <w:tr>
+        <w:tc>
+          <w:tcPr>
+            <w:tcW w:type="dxa" w:w="3456"/>
+          </w:tcPr>
+          <w:p>
+            <w:pPr>
+              <w:spacing w:after="40"/>
+            </w:pPr>
+            <w:r/>
+            <w:r>
+              <w:rPr>
+                <w:sz w:val="18"/>
+              </w:rPr>
+              <w:t>Avoided AOG / diversion (tail risk)</w:t>
+            </w:r>
+          </w:p>
+        </w:tc>
+        <w:tc>
+          <w:tcPr>
+            <w:tcW w:type="dxa" w:w="1584"/>
+          </w:tcPr>
+          <w:p>
+            <w:pPr>
+              <w:spacing w:after="40"/>
+            </w:pPr>
+            <w:r/>
+            <w:r>
+              <w:rPr>
+                <w:sz w:val="18"/>
+              </w:rPr>
+              <w:t>USD 0.4 M</w:t>
+            </w:r>
+          </w:p>
+        </w:tc>
+        <w:tc>
+          <w:tcPr>
+            <w:tcW w:type="dxa" w:w="1584"/>
+          </w:tcPr>
+          <w:p>
+            <w:pPr>
+              <w:spacing w:after="40"/>
+            </w:pPr>
+            <w:r/>
+            <w:r>
+              <w:rPr>
+                <w:sz w:val="18"/>
+              </w:rPr>
+              <w:t>USD 1.2 M</w:t>
+            </w:r>
+          </w:p>
+        </w:tc>
+        <w:tc>
+          <w:tcPr>
+            <w:tcW w:type="dxa" w:w="3312"/>
+          </w:tcPr>
+          <w:p>
+            <w:pPr>
+              <w:spacing w:after="40"/>
+            </w:pPr>
+            <w:r/>
+            <w:r>
+              <w:rPr>
+                <w:sz w:val="18"/>
+              </w:rPr>
+              <w:t>One to five events a year at USD 30,000–80,000 each; this line alone is why operators buy reliability products</w:t>
+            </w:r>
+          </w:p>
+        </w:tc>
+      </w:tr>
+      <w:tr>
+        <w:tc>
+          <w:tcPr>
+            <w:tcW w:type="dxa" w:w="3456"/>
+          </w:tcPr>
+          <w:p>
+            <w:pPr>
+              <w:spacing w:after="40"/>
+            </w:pPr>
+            <w:r/>
+            <w:r>
+              <w:rPr>
+                <w:sz w:val="18"/>
+              </w:rPr>
+              <w:t>Total hard benefit per year</w:t>
+            </w:r>
+          </w:p>
+        </w:tc>
+        <w:tc>
+          <w:tcPr>
+            <w:tcW w:type="dxa" w:w="1584"/>
+          </w:tcPr>
+          <w:p>
+            <w:pPr>
+              <w:spacing w:after="40"/>
+            </w:pPr>
+            <w:r/>
+            <w:r>
+              <w:rPr>
+                <w:sz w:val="18"/>
+              </w:rPr>
+              <w:t>USD 1.4 M</w:t>
+            </w:r>
+          </w:p>
+        </w:tc>
+        <w:tc>
+          <w:tcPr>
+            <w:tcW w:type="dxa" w:w="1584"/>
+          </w:tcPr>
+          <w:p>
+            <w:pPr>
+              <w:spacing w:after="40"/>
+            </w:pPr>
+            <w:r/>
+            <w:r>
+              <w:rPr>
+                <w:sz w:val="18"/>
+              </w:rPr>
+              <w:t>USD 5.0 M</w:t>
+            </w:r>
+          </w:p>
+        </w:tc>
+        <w:tc>
+          <w:tcPr>
+            <w:tcW w:type="dxa" w:w="3312"/>
+          </w:tcPr>
+          <w:p>
+            <w:pPr>
+              <w:spacing w:after="40"/>
+            </w:pPr>
+            <w:r/>
+            <w:r>
+              <w:rPr>
+                <w:sz w:val="18"/>
+              </w:rPr>
+              <w:t>Before counting the intangible: fewer customer-reported defects and a stronger warranty position</w:t>
+            </w:r>
+          </w:p>
+        </w:tc>
+      </w:tr>
+      <w:tr>
+        <w:tc>
+          <w:tcPr>
+            <w:tcW w:type="dxa" w:w="3456"/>
+          </w:tcPr>
+          <w:p>
+            <w:pPr>
+              <w:spacing w:after="40"/>
+            </w:pPr>
+            <w:r/>
+            <w:r>
+              <w:rPr>
+                <w:sz w:val="18"/>
+              </w:rPr>
+              <w:t>What the airline pays (list price)</w:t>
+            </w:r>
+          </w:p>
+        </w:tc>
+        <w:tc>
+          <w:tcPr>
+            <w:tcW w:type="dxa" w:w="1584"/>
+          </w:tcPr>
+          <w:p>
+            <w:pPr>
+              <w:spacing w:after="40"/>
+            </w:pPr>
+            <w:r/>
+            <w:r>
+              <w:rPr>
+                <w:sz w:val="18"/>
+              </w:rPr>
+              <w:t>USD 1.8 M</w:t>
+            </w:r>
+          </w:p>
+        </w:tc>
+        <w:tc>
+          <w:tcPr>
+            <w:tcW w:type="dxa" w:w="1584"/>
+          </w:tcPr>
+          <w:p>
+            <w:pPr>
+              <w:spacing w:after="40"/>
+            </w:pPr>
+            <w:r/>
+            <w:r>
+              <w:rPr>
+                <w:sz w:val="18"/>
+              </w:rPr>
+              <w:t>USD 3.0 M</w:t>
+            </w:r>
+          </w:p>
+        </w:tc>
+        <w:tc>
+          <w:tcPr>
+            <w:tcW w:type="dxa" w:w="3312"/>
+          </w:tcPr>
+          <w:p>
+            <w:pPr>
+              <w:spacing w:after="40"/>
+            </w:pPr>
+            <w:r/>
+            <w:r>
+              <w:rPr>
+                <w:sz w:val="18"/>
+              </w:rPr>
+              <w:t>500 tails at USD 3,600–6,000 per tail per year, depending on verdict depth</w:t>
+            </w:r>
+          </w:p>
+        </w:tc>
+      </w:tr>
+      <w:tr>
+        <w:tc>
+          <w:tcPr>
+            <w:tcW w:type="dxa" w:w="3456"/>
+          </w:tcPr>
+          <w:p>
+            <w:pPr>
+              <w:spacing w:after="40"/>
+            </w:pPr>
+            <w:r/>
+            <w:r>
+              <w:rPr>
+                <w:sz w:val="18"/>
+              </w:rPr>
+              <w:t>What the airline pays (OEM-sponsored structure)</w:t>
+            </w:r>
+          </w:p>
+        </w:tc>
+        <w:tc>
+          <w:tcPr>
+            <w:tcW w:type="dxa" w:w="1584"/>
+          </w:tcPr>
+          <w:p>
+            <w:pPr>
+              <w:spacing w:after="40"/>
+            </w:pPr>
+            <w:r/>
+            <w:r>
+              <w:rPr>
+                <w:sz w:val="18"/>
+              </w:rPr>
+              <w:t>USD 0.9–1.3 M</w:t>
+            </w:r>
+          </w:p>
+        </w:tc>
+        <w:tc>
+          <w:tcPr>
+            <w:tcW w:type="dxa" w:w="1584"/>
+          </w:tcPr>
+          <w:p>
+            <w:pPr>
+              <w:spacing w:after="40"/>
+            </w:pPr>
+            <w:r/>
+            <w:r>
+              <w:rPr>
+                <w:sz w:val="18"/>
+              </w:rPr>
+              <w:t>USD 1.8–2.4 M</w:t>
+            </w:r>
+          </w:p>
+        </w:tc>
+        <w:tc>
+          <w:tcPr>
+            <w:tcW w:type="dxa" w:w="3312"/>
+          </w:tcPr>
+          <w:p>
+            <w:pPr>
+              <w:spacing w:after="40"/>
+            </w:pPr>
+            <w:r/>
+            <w:r>
+              <w:rPr>
+                <w:sz w:val="18"/>
+              </w:rPr>
+              <w:t>Where the OEM funds 30–60 % of the subscription out of its own warranty and support savings, which is the structure that closes deals in a conservative year</w:t>
+            </w:r>
+          </w:p>
+        </w:tc>
+      </w:tr>
+    </w:tbl>
+    <w:p>
+      <w:pPr>
+        <w:spacing w:after="40"/>
+      </w:pPr>
+    </w:p>
+    <w:p>
+      <w:pPr>
+        <w:ind w:left="173"/>
+        <w:pBdr>
+          <w:top w:val="single" w:sz="6" w:space="5" w:color="BFA100"/>
+          <w:bottom w:val="single" w:sz="6" w:space="5" w:color="BFA100"/>
+          <w:left w:val="single" w:sz="6" w:space="5" w:color="BFA100"/>
+          <w:right w:val="single" w:sz="6" w:space="5" w:color="BFA100"/>
+        </w:pBdr>
+        <w:shd w:fill="FFF4CE"/>
+      </w:pPr>
+      <w:r>
+        <w:rPr>
+          <w:sz w:val="19"/>
+        </w:rPr>
+        <w:t>Read the table honestly: at list price, hard savings alone justify the subscription only in the base case. In the conservative case the deal is closed either by the OEM part-funding the subscription out of its own savings, or by the tail-risk argument — one avoided AOG and the year is paid for. This is why the OEM line in Figure 8 is the fastest route to profitability: the OEM saves money on the same evidence, with no new hardware and no change to the aircraft.</w:t>
+      </w:r>
+    </w:p>
+    <w:p>
+      <w:pPr>
+        <w:pStyle w:val="Heading2"/>
+      </w:pPr>
+      <w:r>
+        <w:t>8.8 What it is worth to the OEM (per programme, per year)</w:t>
+      </w:r>
+    </w:p>
+    <w:tbl>
+      <w:tblPr>
+        <w:tblStyle w:val="TableGrid"/>
+        <w:tblW w:type="auto" w:w="0"/>
+        <w:jc w:val="center"/>
+        <w:tblLook w:firstColumn="1" w:firstRow="1" w:lastColumn="0" w:lastRow="0" w:noHBand="0" w:noVBand="1" w:val="04A0"/>
+      </w:tblPr>
+      <w:tblGrid>
+        <w:gridCol w:w="3312"/>
+        <w:gridCol w:w="3312"/>
+        <w:gridCol w:w="3312"/>
+      </w:tblGrid>
+      <w:tr>
+        <w:tc>
+          <w:tcPr>
+            <w:tcW w:type="dxa" w:w="3168"/>
+            <w:shd w:fill="DCE6F1"/>
+          </w:tcPr>
+          <w:p>
+            <w:r/>
+            <w:r>
+              <w:rPr>
+                <w:b/>
+                <w:sz w:val="18"/>
+              </w:rPr>
+              <w:t>OEM benefit line</w:t>
+            </w:r>
+          </w:p>
+        </w:tc>
+        <w:tc>
+          <w:tcPr>
+            <w:tcW w:type="dxa" w:w="4896"/>
+            <w:shd w:fill="DCE6F1"/>
+          </w:tcPr>
+          <w:p>
+            <w:r/>
+            <w:r>
+              <w:rPr>
+                <w:b/>
+                <w:sz w:val="18"/>
+              </w:rPr>
+              <w:t>Basis of the estimate</w:t>
+            </w:r>
+          </w:p>
+        </w:tc>
+        <w:tc>
+          <w:tcPr>
+            <w:tcW w:type="dxa" w:w="1872"/>
+            <w:shd w:fill="DCE6F1"/>
+          </w:tcPr>
+          <w:p>
+            <w:r/>
+            <w:r>
+              <w:rPr>
+                <w:b/>
+                <w:sz w:val="18"/>
+              </w:rPr>
+              <w:t>Indicative range</w:t>
+            </w:r>
+          </w:p>
+        </w:tc>
+      </w:tr>
+      <w:tr>
+        <w:tc>
+          <w:tcPr>
+            <w:tcW w:type="dxa" w:w="3168"/>
+          </w:tcPr>
+          <w:p>
+            <w:pPr>
+              <w:spacing w:after="40"/>
+            </w:pPr>
+            <w:r/>
+            <w:r>
+              <w:rPr>
+                <w:sz w:val="18"/>
+              </w:rPr>
+              <w:t>Warranty and no-fault-found cost removed</w:t>
+            </w:r>
+          </w:p>
+        </w:tc>
+        <w:tc>
+          <w:tcPr>
+            <w:tcW w:type="dxa" w:w="4896"/>
+          </w:tcPr>
+          <w:p>
+            <w:pPr>
+              <w:spacing w:after="40"/>
+            </w:pPr>
+            <w:r/>
+            <w:r>
+              <w:rPr>
+                <w:sz w:val="18"/>
+              </w:rPr>
+              <w:t>1–3 % of warranty spend on a communications product line, where a line of this kind can carry USD 20–60 M of warranty cost per year in the installed base</w:t>
+            </w:r>
+          </w:p>
+        </w:tc>
+        <w:tc>
+          <w:tcPr>
+            <w:tcW w:type="dxa" w:w="1872"/>
+          </w:tcPr>
+          <w:p>
+            <w:pPr>
+              <w:spacing w:after="40"/>
+            </w:pPr>
+            <w:r/>
+            <w:r>
+              <w:rPr>
+                <w:sz w:val="18"/>
+              </w:rPr>
+              <w:t>USD 0.5–2.0 M</w:t>
+            </w:r>
+          </w:p>
+        </w:tc>
+      </w:tr>
+      <w:tr>
+        <w:tc>
+          <w:tcPr>
+            <w:tcW w:type="dxa" w:w="3168"/>
+          </w:tcPr>
+          <w:p>
+            <w:pPr>
+              <w:spacing w:after="40"/>
+            </w:pPr>
+            <w:r/>
+            <w:r>
+              <w:rPr>
+                <w:sz w:val="18"/>
+              </w:rPr>
+              <w:t>Support cases deflected</w:t>
+            </w:r>
+          </w:p>
+        </w:tc>
+        <w:tc>
+          <w:tcPr>
+            <w:tcW w:type="dxa" w:w="4896"/>
+          </w:tcPr>
+          <w:p>
+            <w:pPr>
+              <w:spacing w:after="40"/>
+            </w:pPr>
+            <w:r/>
+            <w:r>
+              <w:rPr>
+                <w:sz w:val="18"/>
+              </w:rPr>
+              <w:t>15–30 % of technical-support volume at a fully-loaded cost per case</w:t>
+            </w:r>
+          </w:p>
+        </w:tc>
+        <w:tc>
+          <w:tcPr>
+            <w:tcW w:type="dxa" w:w="1872"/>
+          </w:tcPr>
+          <w:p>
+            <w:pPr>
+              <w:spacing w:after="40"/>
+            </w:pPr>
+            <w:r/>
+            <w:r>
+              <w:rPr>
+                <w:sz w:val="18"/>
+              </w:rPr>
+              <w:t>USD 0.3–1.0 M</w:t>
+            </w:r>
+          </w:p>
+        </w:tc>
+      </w:tr>
+      <w:tr>
+        <w:tc>
+          <w:tcPr>
+            <w:tcW w:type="dxa" w:w="3168"/>
+          </w:tcPr>
+          <w:p>
+            <w:pPr>
+              <w:spacing w:after="40"/>
+            </w:pPr>
+            <w:r/>
+            <w:r>
+              <w:rPr>
+                <w:sz w:val="18"/>
+              </w:rPr>
+              <w:t>Fleet-wide fixes avoided or bounded</w:t>
+            </w:r>
+          </w:p>
+        </w:tc>
+        <w:tc>
+          <w:tcPr>
+            <w:tcW w:type="dxa" w:w="4896"/>
+          </w:tcPr>
+          <w:p>
+            <w:pPr>
+              <w:spacing w:after="40"/>
+            </w:pPr>
+            <w:r/>
+            <w:r>
+              <w:rPr>
+                <w:sz w:val="18"/>
+              </w:rPr>
+              <w:t>One service bulletin or fleet-wide retrofit avoided, or a population-limited fix instead of a fleet-wide one; a single fleet action can cost USD 0.5–3 M</w:t>
+            </w:r>
+          </w:p>
+        </w:tc>
+        <w:tc>
+          <w:tcPr>
+            <w:tcW w:type="dxa" w:w="1872"/>
+          </w:tcPr>
+          <w:p>
+            <w:pPr>
+              <w:spacing w:after="40"/>
+            </w:pPr>
+            <w:r/>
+            <w:r>
+              <w:rPr>
+                <w:sz w:val="18"/>
+              </w:rPr>
+              <w:t>USD 0.2–1.0 M</w:t>
+            </w:r>
+          </w:p>
+        </w:tc>
+      </w:tr>
+      <w:tr>
+        <w:tc>
+          <w:tcPr>
+            <w:tcW w:type="dxa" w:w="3168"/>
+          </w:tcPr>
+          <w:p>
+            <w:pPr>
+              <w:spacing w:after="40"/>
+            </w:pPr>
+            <w:r/>
+            <w:r>
+              <w:rPr>
+                <w:sz w:val="18"/>
+              </w:rPr>
+              <w:t>Upgrade campaigns targeted</w:t>
+            </w:r>
+          </w:p>
+        </w:tc>
+        <w:tc>
+          <w:tcPr>
+            <w:tcW w:type="dxa" w:w="4896"/>
+          </w:tcPr>
+          <w:p>
+            <w:pPr>
+              <w:spacing w:after="40"/>
+            </w:pPr>
+            <w:r/>
+            <w:r>
+              <w:rPr>
+                <w:sz w:val="18"/>
+              </w:rPr>
+              <w:t>Fewer, better-targeted upgrades, plus pull-through of the upgrade itself</w:t>
+            </w:r>
+          </w:p>
+        </w:tc>
+        <w:tc>
+          <w:tcPr>
+            <w:tcW w:type="dxa" w:w="1872"/>
+          </w:tcPr>
+          <w:p>
+            <w:pPr>
+              <w:spacing w:after="40"/>
+            </w:pPr>
+            <w:r/>
+            <w:r>
+              <w:rPr>
+                <w:sz w:val="18"/>
+              </w:rPr>
+              <w:t>USD 0.2–0.5 M</w:t>
+            </w:r>
+          </w:p>
+        </w:tc>
+      </w:tr>
+      <w:tr>
+        <w:tc>
+          <w:tcPr>
+            <w:tcW w:type="dxa" w:w="3168"/>
+          </w:tcPr>
+          <w:p>
+            <w:pPr>
+              <w:spacing w:after="40"/>
+            </w:pPr>
+            <w:r/>
+            <w:r>
+              <w:rPr>
+                <w:sz w:val="18"/>
+              </w:rPr>
+              <w:t>New services revenue to the OEM customer base</w:t>
+            </w:r>
+          </w:p>
+        </w:tc>
+        <w:tc>
+          <w:tcPr>
+            <w:tcW w:type="dxa" w:w="4896"/>
+          </w:tcPr>
+          <w:p>
+            <w:pPr>
+              <w:spacing w:after="40"/>
+            </w:pPr>
+            <w:r/>
+            <w:r>
+              <w:rPr>
+                <w:sz w:val="18"/>
+              </w:rPr>
+              <w:t>Reliability intelligence sold alongside the maintenance agreement</w:t>
+            </w:r>
+          </w:p>
+        </w:tc>
+        <w:tc>
+          <w:tcPr>
+            <w:tcW w:type="dxa" w:w="1872"/>
+          </w:tcPr>
+          <w:p>
+            <w:pPr>
+              <w:spacing w:after="40"/>
+            </w:pPr>
+            <w:r/>
+            <w:r>
+              <w:rPr>
+                <w:sz w:val="18"/>
+              </w:rPr>
+              <w:t>USD 0.5–2.0 M</w:t>
+            </w:r>
+          </w:p>
+        </w:tc>
+      </w:tr>
+      <w:tr>
+        <w:tc>
+          <w:tcPr>
+            <w:tcW w:type="dxa" w:w="3168"/>
+          </w:tcPr>
+          <w:p>
+            <w:pPr>
+              <w:spacing w:after="40"/>
+            </w:pPr>
+            <w:r/>
+            <w:r>
+              <w:rPr>
+                <w:sz w:val="18"/>
+              </w:rPr>
+              <w:t>Total OEM benefit</w:t>
+            </w:r>
+          </w:p>
+        </w:tc>
+        <w:tc>
+          <w:tcPr>
+            <w:tcW w:type="dxa" w:w="4896"/>
+          </w:tcPr>
+          <w:p>
+            <w:pPr>
+              <w:spacing w:after="40"/>
+            </w:pPr>
+            <w:r/>
+            <w:r>
+              <w:rPr>
+                <w:sz w:val="18"/>
+              </w:rPr>
+            </w:r>
+          </w:p>
+        </w:tc>
+        <w:tc>
+          <w:tcPr>
+            <w:tcW w:type="dxa" w:w="1872"/>
+          </w:tcPr>
+          <w:p>
+            <w:pPr>
+              <w:spacing w:after="40"/>
+            </w:pPr>
+            <w:r/>
+            <w:r>
+              <w:rPr>
+                <w:sz w:val="18"/>
+              </w:rPr>
+              <w:t>USD 1.7–6.5 M</w:t>
+            </w:r>
+          </w:p>
+        </w:tc>
+      </w:tr>
+      <w:tr>
+        <w:tc>
+          <w:tcPr>
+            <w:tcW w:type="dxa" w:w="3168"/>
+          </w:tcPr>
+          <w:p>
+            <w:pPr>
+              <w:spacing w:after="40"/>
+            </w:pPr>
+            <w:r/>
+            <w:r>
+              <w:rPr>
+                <w:sz w:val="18"/>
+              </w:rPr>
+              <w:t>Licence cost to the OEM</w:t>
+            </w:r>
+          </w:p>
+        </w:tc>
+        <w:tc>
+          <w:tcPr>
+            <w:tcW w:type="dxa" w:w="4896"/>
+          </w:tcPr>
+          <w:p>
+            <w:pPr>
+              <w:spacing w:after="40"/>
+            </w:pPr>
+            <w:r/>
+            <w:r>
+              <w:rPr>
+                <w:sz w:val="18"/>
+              </w:rPr>
+              <w:t>Priced below the benefit so the OEM retains most of the value</w:t>
+            </w:r>
+          </w:p>
+        </w:tc>
+        <w:tc>
+          <w:tcPr>
+            <w:tcW w:type="dxa" w:w="1872"/>
+          </w:tcPr>
+          <w:p>
+            <w:pPr>
+              <w:spacing w:after="40"/>
+            </w:pPr>
+            <w:r/>
+            <w:r>
+              <w:rPr>
+                <w:sz w:val="18"/>
+              </w:rPr>
+              <w:t>USD 1–5 M per programme per year plus NRE</w:t>
+            </w:r>
+          </w:p>
+        </w:tc>
+      </w:tr>
+    </w:tbl>
+    <w:p>
+      <w:pPr>
+        <w:spacing w:after="40"/>
+      </w:pPr>
+    </w:p>
+    <w:p>
+      <w:r>
+        <w:rPr>
+          <w:b w:val="0"/>
+          <w:i w:val="0"/>
+        </w:rPr>
+        <w:t>Note what is deliberately absent from this list: nothing requires new avionics, a new STC, or a change to the certified product. The platform consumes data the aircraft already produces. That is what makes the OEM conversation about a data-services agreement rather than an engineering programme — and it is also why the OEM can move quickly.</w:t>
+      </w:r>
+    </w:p>
+    <w:p>
+      <w:pPr>
+        <w:pStyle w:val="Heading2"/>
+      </w:pPr>
+      <w:r>
+        <w:t>8.9 How much we can earn: the pricing model</w:t>
+      </w:r>
+    </w:p>
+    <w:tbl>
+      <w:tblPr>
+        <w:tblStyle w:val="TableGrid"/>
+        <w:tblW w:type="auto" w:w="0"/>
+        <w:jc w:val="center"/>
+        <w:tblLook w:firstColumn="1" w:firstRow="1" w:lastColumn="0" w:lastRow="0" w:noHBand="0" w:noVBand="1" w:val="04A0"/>
+      </w:tblPr>
+      <w:tblGrid>
+        <w:gridCol w:w="2484"/>
+        <w:gridCol w:w="2484"/>
+        <w:gridCol w:w="2484"/>
+        <w:gridCol w:w="2484"/>
+      </w:tblGrid>
+      <w:tr>
+        <w:tc>
+          <w:tcPr>
+            <w:tcW w:type="dxa" w:w="3168"/>
+            <w:shd w:fill="DCE6F1"/>
+          </w:tcPr>
+          <w:p>
+            <w:r/>
+            <w:r>
+              <w:rPr>
+                <w:b/>
+                <w:sz w:val="18"/>
+              </w:rPr>
+              <w:t>Revenue line</w:t>
+            </w:r>
+          </w:p>
+        </w:tc>
+        <w:tc>
+          <w:tcPr>
+            <w:tcW w:type="dxa" w:w="1872"/>
+            <w:shd w:fill="DCE6F1"/>
+          </w:tcPr>
+          <w:p>
+            <w:r/>
+            <w:r>
+              <w:rPr>
+                <w:b/>
+                <w:sz w:val="18"/>
+              </w:rPr>
+              <w:t>Unit</w:t>
+            </w:r>
+          </w:p>
+        </w:tc>
+        <w:tc>
+          <w:tcPr>
+            <w:tcW w:type="dxa" w:w="1728"/>
+            <w:shd w:fill="DCE6F1"/>
+          </w:tcPr>
+          <w:p>
+            <w:r/>
+            <w:r>
+              <w:rPr>
+                <w:b/>
+                <w:sz w:val="18"/>
+              </w:rPr>
+              <w:t>Price</w:t>
+            </w:r>
+          </w:p>
+        </w:tc>
+        <w:tc>
+          <w:tcPr>
+            <w:tcW w:type="dxa" w:w="3168"/>
+            <w:shd w:fill="DCE6F1"/>
+          </w:tcPr>
+          <w:p>
+            <w:r/>
+            <w:r>
+              <w:rPr>
+                <w:b/>
+                <w:sz w:val="18"/>
+              </w:rPr>
+              <w:t>Notes</w:t>
+            </w:r>
+          </w:p>
+        </w:tc>
+      </w:tr>
+      <w:tr>
+        <w:tc>
+          <w:tcPr>
+            <w:tcW w:type="dxa" w:w="3168"/>
+          </w:tcPr>
+          <w:p>
+            <w:pPr>
+              <w:spacing w:after="40"/>
+            </w:pPr>
+            <w:r/>
+            <w:r>
+              <w:rPr>
+                <w:sz w:val="18"/>
+              </w:rPr>
+              <w:t>Airline subscription, tier A</w:t>
+            </w:r>
+          </w:p>
+        </w:tc>
+        <w:tc>
+          <w:tcPr>
+            <w:tcW w:type="dxa" w:w="1872"/>
+          </w:tcPr>
+          <w:p>
+            <w:pPr>
+              <w:spacing w:after="40"/>
+            </w:pPr>
+            <w:r/>
+            <w:r>
+              <w:rPr>
+                <w:sz w:val="18"/>
+              </w:rPr>
+              <w:t>Per tail per year</w:t>
+            </w:r>
+          </w:p>
+        </w:tc>
+        <w:tc>
+          <w:tcPr>
+            <w:tcW w:type="dxa" w:w="1728"/>
+          </w:tcPr>
+          <w:p>
+            <w:pPr>
+              <w:spacing w:after="40"/>
+            </w:pPr>
+            <w:r/>
+            <w:r>
+              <w:rPr>
+                <w:sz w:val="18"/>
+              </w:rPr>
+              <w:t>USD 3,600</w:t>
+            </w:r>
+          </w:p>
+        </w:tc>
+        <w:tc>
+          <w:tcPr>
+            <w:tcW w:type="dxa" w:w="3168"/>
+          </w:tcPr>
+          <w:p>
+            <w:pPr>
+              <w:spacing w:after="40"/>
+            </w:pPr>
+            <w:r/>
+            <w:r>
+              <w:rPr>
+                <w:sz w:val="18"/>
+              </w:rPr>
+              <w:t>Message feed, ground network, own receivers: message-flow, crew-response and network verdicts</w:t>
+            </w:r>
+          </w:p>
+        </w:tc>
+      </w:tr>
+      <w:tr>
+        <w:tc>
+          <w:tcPr>
+            <w:tcW w:type="dxa" w:w="3168"/>
+          </w:tcPr>
+          <w:p>
+            <w:pPr>
+              <w:spacing w:after="40"/>
+            </w:pPr>
+            <w:r/>
+            <w:r>
+              <w:rPr>
+                <w:sz w:val="18"/>
+              </w:rPr>
+              <w:t>Airline subscription, tier B</w:t>
+            </w:r>
+          </w:p>
+        </w:tc>
+        <w:tc>
+          <w:tcPr>
+            <w:tcW w:type="dxa" w:w="1872"/>
+          </w:tcPr>
+          <w:p>
+            <w:pPr>
+              <w:spacing w:after="40"/>
+            </w:pPr>
+            <w:r/>
+            <w:r>
+              <w:rPr>
+                <w:sz w:val="18"/>
+              </w:rPr>
+              <w:t>Per tail per year</w:t>
+            </w:r>
+          </w:p>
+        </w:tc>
+        <w:tc>
+          <w:tcPr>
+            <w:tcW w:type="dxa" w:w="1728"/>
+          </w:tcPr>
+          <w:p>
+            <w:pPr>
+              <w:spacing w:after="40"/>
+            </w:pPr>
+            <w:r/>
+            <w:r>
+              <w:rPr>
+                <w:sz w:val="18"/>
+              </w:rPr>
+              <w:t>USD 4,800</w:t>
+            </w:r>
+          </w:p>
+        </w:tc>
+        <w:tc>
+          <w:tcPr>
+            <w:tcW w:type="dxa" w:w="3168"/>
+          </w:tcPr>
+          <w:p>
+            <w:pPr>
+              <w:spacing w:after="40"/>
+            </w:pPr>
+            <w:r/>
+            <w:r>
+              <w:rPr>
+                <w:sz w:val="18"/>
+              </w:rPr>
+              <w:t>Adds ACMS reports: host, resource and fault verdicts in flight</w:t>
+            </w:r>
+          </w:p>
+        </w:tc>
+      </w:tr>
+      <w:tr>
+        <w:tc>
+          <w:tcPr>
+            <w:tcW w:type="dxa" w:w="3168"/>
+          </w:tcPr>
+          <w:p>
+            <w:pPr>
+              <w:spacing w:after="40"/>
+            </w:pPr>
+            <w:r/>
+            <w:r>
+              <w:rPr>
+                <w:sz w:val="18"/>
+              </w:rPr>
+              <w:t>Airline subscription, tier C</w:t>
+            </w:r>
+          </w:p>
+        </w:tc>
+        <w:tc>
+          <w:tcPr>
+            <w:tcW w:type="dxa" w:w="1872"/>
+          </w:tcPr>
+          <w:p>
+            <w:pPr>
+              <w:spacing w:after="40"/>
+            </w:pPr>
+            <w:r/>
+            <w:r>
+              <w:rPr>
+                <w:sz w:val="18"/>
+              </w:rPr>
+              <w:t>Per tail per year</w:t>
+            </w:r>
+          </w:p>
+        </w:tc>
+        <w:tc>
+          <w:tcPr>
+            <w:tcW w:type="dxa" w:w="1728"/>
+          </w:tcPr>
+          <w:p>
+            <w:pPr>
+              <w:spacing w:after="40"/>
+            </w:pPr>
+            <w:r/>
+            <w:r>
+              <w:rPr>
+                <w:sz w:val="18"/>
+              </w:rPr>
+              <w:t>USD 6,000</w:t>
+            </w:r>
+          </w:p>
+        </w:tc>
+        <w:tc>
+          <w:tcPr>
+            <w:tcW w:type="dxa" w:w="3168"/>
+          </w:tcPr>
+          <w:p>
+            <w:pPr>
+              <w:spacing w:after="40"/>
+            </w:pPr>
+            <w:r/>
+            <w:r>
+              <w:rPr>
+                <w:sz w:val="18"/>
+              </w:rPr>
+              <w:t>Adds partition and QAR depth, coverage account and the full conformance record</w:t>
+            </w:r>
+          </w:p>
+        </w:tc>
+      </w:tr>
+      <w:tr>
+        <w:tc>
+          <w:tcPr>
+            <w:tcW w:type="dxa" w:w="3168"/>
+          </w:tcPr>
+          <w:p>
+            <w:pPr>
+              <w:spacing w:after="40"/>
+            </w:pPr>
+            <w:r/>
+            <w:r>
+              <w:rPr>
+                <w:sz w:val="18"/>
+              </w:rPr>
+              <w:t>OEM data-services licence</w:t>
+            </w:r>
+          </w:p>
+        </w:tc>
+        <w:tc>
+          <w:tcPr>
+            <w:tcW w:type="dxa" w:w="1872"/>
+          </w:tcPr>
+          <w:p>
+            <w:pPr>
+              <w:spacing w:after="40"/>
+            </w:pPr>
+            <w:r/>
+            <w:r>
+              <w:rPr>
+                <w:sz w:val="18"/>
+              </w:rPr>
+              <w:t>Per programme per year</w:t>
+            </w:r>
+          </w:p>
+        </w:tc>
+        <w:tc>
+          <w:tcPr>
+            <w:tcW w:type="dxa" w:w="1728"/>
+          </w:tcPr>
+          <w:p>
+            <w:pPr>
+              <w:spacing w:after="40"/>
+            </w:pPr>
+            <w:r/>
+            <w:r>
+              <w:rPr>
+                <w:sz w:val="18"/>
+              </w:rPr>
+              <w:t>USD 1–5 M</w:t>
+            </w:r>
+          </w:p>
+        </w:tc>
+        <w:tc>
+          <w:tcPr>
+            <w:tcW w:type="dxa" w:w="3168"/>
+          </w:tcPr>
+          <w:p>
+            <w:pPr>
+              <w:spacing w:after="40"/>
+            </w:pPr>
+            <w:r/>
+            <w:r>
+              <w:rPr>
+                <w:sz w:val="18"/>
+              </w:rPr>
+              <w:t>Fleet-wide visibility of the OEM product across customer airlines, plus NRE for integration</w:t>
+            </w:r>
+          </w:p>
+        </w:tc>
+      </w:tr>
+      <w:tr>
+        <w:tc>
+          <w:tcPr>
+            <w:tcW w:type="dxa" w:w="3168"/>
+          </w:tcPr>
+          <w:p>
+            <w:pPr>
+              <w:spacing w:after="40"/>
+            </w:pPr>
+            <w:r/>
+            <w:r>
+              <w:rPr>
+                <w:sz w:val="18"/>
+              </w:rPr>
+              <w:t>Engineering services</w:t>
+            </w:r>
+          </w:p>
+        </w:tc>
+        <w:tc>
+          <w:tcPr>
+            <w:tcW w:type="dxa" w:w="1872"/>
+          </w:tcPr>
+          <w:p>
+            <w:pPr>
+              <w:spacing w:after="40"/>
+            </w:pPr>
+            <w:r/>
+            <w:r>
+              <w:rPr>
+                <w:sz w:val="18"/>
+              </w:rPr>
+              <w:t>Per engagement</w:t>
+            </w:r>
+          </w:p>
+        </w:tc>
+        <w:tc>
+          <w:tcPr>
+            <w:tcW w:type="dxa" w:w="1728"/>
+          </w:tcPr>
+          <w:p>
+            <w:pPr>
+              <w:spacing w:after="40"/>
+            </w:pPr>
+            <w:r/>
+            <w:r>
+              <w:rPr>
+                <w:sz w:val="18"/>
+              </w:rPr>
+              <w:t>USD 150–400k</w:t>
+            </w:r>
+          </w:p>
+        </w:tc>
+        <w:tc>
+          <w:tcPr>
+            <w:tcW w:type="dxa" w:w="3168"/>
+          </w:tcPr>
+          <w:p>
+            <w:pPr>
+              <w:spacing w:after="40"/>
+            </w:pPr>
+            <w:r/>
+            <w:r>
+              <w:rPr>
+                <w:sz w:val="18"/>
+              </w:rPr>
+              <w:t>Requirement baselines, ACMS report definitions, authority evidence packages, fleet onboarding</w:t>
+            </w:r>
+          </w:p>
+        </w:tc>
+      </w:tr>
+      <w:tr>
+        <w:tc>
+          <w:tcPr>
+            <w:tcW w:type="dxa" w:w="3168"/>
+          </w:tcPr>
+          <w:p>
+            <w:pPr>
+              <w:spacing w:after="40"/>
+            </w:pPr>
+            <w:r/>
+            <w:r>
+              <w:rPr>
+                <w:sz w:val="18"/>
+              </w:rPr>
+              <w:t>Patent licensing / defensive value</w:t>
+            </w:r>
+          </w:p>
+        </w:tc>
+        <w:tc>
+          <w:tcPr>
+            <w:tcW w:type="dxa" w:w="1872"/>
+          </w:tcPr>
+          <w:p>
+            <w:pPr>
+              <w:spacing w:after="40"/>
+            </w:pPr>
+            <w:r/>
+            <w:r>
+              <w:rPr>
+                <w:sz w:val="18"/>
+              </w:rPr>
+              <w:t>Per licensee</w:t>
+            </w:r>
+          </w:p>
+        </w:tc>
+        <w:tc>
+          <w:tcPr>
+            <w:tcW w:type="dxa" w:w="1728"/>
+          </w:tcPr>
+          <w:p>
+            <w:pPr>
+              <w:spacing w:after="40"/>
+            </w:pPr>
+            <w:r/>
+            <w:r>
+              <w:rPr>
+                <w:sz w:val="18"/>
+              </w:rPr>
+              <w:t>Not modelled as a product</w:t>
+            </w:r>
+          </w:p>
+        </w:tc>
+        <w:tc>
+          <w:tcPr>
+            <w:tcW w:type="dxa" w:w="3168"/>
+          </w:tcPr>
+          <w:p>
+            <w:pPr>
+              <w:spacing w:after="40"/>
+            </w:pPr>
+            <w:r/>
+            <w:r>
+              <w:rPr>
+                <w:sz w:val="18"/>
+              </w:rPr>
+              <w:t>The lead family and the coverage-account family are the licensing hook; value here is optionality, not revenue</w:t>
+            </w:r>
+          </w:p>
+        </w:tc>
+      </w:tr>
+      <w:tr>
+        <w:tc>
+          <w:tcPr>
+            <w:tcW w:type="dxa" w:w="3168"/>
+          </w:tcPr>
+          <w:p>
+            <w:pPr>
+              <w:spacing w:after="40"/>
+            </w:pPr>
+            <w:r/>
+            <w:r>
+              <w:rPr>
+                <w:sz w:val="18"/>
+              </w:rPr>
+              <w:t>Gross margin at scale</w:t>
+            </w:r>
+          </w:p>
+        </w:tc>
+        <w:tc>
+          <w:tcPr>
+            <w:tcW w:type="dxa" w:w="1872"/>
+          </w:tcPr>
+          <w:p>
+            <w:pPr>
+              <w:spacing w:after="40"/>
+            </w:pPr>
+            <w:r/>
+            <w:r>
+              <w:rPr>
+                <w:sz w:val="18"/>
+              </w:rPr>
+              <w:t>70–80 %</w:t>
+            </w:r>
+          </w:p>
+        </w:tc>
+        <w:tc>
+          <w:tcPr>
+            <w:tcW w:type="dxa" w:w="1728"/>
+          </w:tcPr>
+          <w:p>
+            <w:pPr>
+              <w:spacing w:after="40"/>
+            </w:pPr>
+            <w:r/>
+            <w:r>
+              <w:rPr>
+                <w:sz w:val="18"/>
+              </w:rPr>
+              <w:t>Cost to serve one more tail is a few dollars a month of infrastructure; the expensive parts are data rights and people, not compute</w:t>
+            </w:r>
+          </w:p>
+        </w:tc>
+        <w:tc>
+          <w:tcPr>
+            <w:tcW w:type="dxa" w:w="3168"/>
+          </w:tcPr>
+          <w:p/>
+        </w:tc>
+      </w:tr>
+    </w:tbl>
+    <w:p>
+      <w:pPr>
+        <w:spacing w:after="40"/>
+      </w:pPr>
+    </w:p>
+    <w:p>
+      <w:pPr>
+        <w:pStyle w:val="Heading2"/>
+      </w:pPr>
+      <w:r>
+        <w:t>8.10 Revenue scenarios and what it costs to get there</w:t>
+      </w:r>
+    </w:p>
+    <w:tbl>
+      <w:tblPr>
+        <w:tblStyle w:val="TableGrid"/>
+        <w:tblW w:type="auto" w:w="0"/>
+        <w:jc w:val="center"/>
+        <w:tblLook w:firstColumn="1" w:firstRow="1" w:lastColumn="0" w:lastRow="0" w:noHBand="0" w:noVBand="1" w:val="04A0"/>
+      </w:tblPr>
+      <w:tblGrid>
+        <w:gridCol w:w="1987"/>
+        <w:gridCol w:w="1987"/>
+        <w:gridCol w:w="1987"/>
+        <w:gridCol w:w="1987"/>
+        <w:gridCol w:w="1987"/>
+      </w:tblGrid>
+      <w:tr>
+        <w:tc>
+          <w:tcPr>
+            <w:tcW w:type="dxa" w:w="1872"/>
+            <w:shd w:fill="DCE6F1"/>
+          </w:tcPr>
+          <w:p>
+            <w:r/>
+            <w:r>
+              <w:rPr>
+                <w:b/>
+                <w:sz w:val="18"/>
+              </w:rPr>
+              <w:t>Scenario</w:t>
+            </w:r>
+          </w:p>
+        </w:tc>
+        <w:tc>
+          <w:tcPr>
+            <w:tcW w:type="dxa" w:w="3168"/>
+            <w:shd w:fill="DCE6F1"/>
+          </w:tcPr>
+          <w:p>
+            <w:r/>
+            <w:r>
+              <w:rPr>
+                <w:b/>
+                <w:sz w:val="18"/>
+              </w:rPr>
+              <w:t>Assumes</w:t>
+            </w:r>
+          </w:p>
+        </w:tc>
+        <w:tc>
+          <w:tcPr>
+            <w:tcW w:type="dxa" w:w="1872"/>
+            <w:shd w:fill="DCE6F1"/>
+          </w:tcPr>
+          <w:p>
+            <w:r/>
+            <w:r>
+              <w:rPr>
+                <w:b/>
+                <w:sz w:val="18"/>
+              </w:rPr>
+              <w:t>Annual revenue at maturity</w:t>
+            </w:r>
+          </w:p>
+        </w:tc>
+        <w:tc>
+          <w:tcPr>
+            <w:tcW w:type="dxa" w:w="1440"/>
+            <w:shd w:fill="DCE6F1"/>
+          </w:tcPr>
+          <w:p>
+            <w:r/>
+            <w:r>
+              <w:rPr>
+                <w:b/>
+                <w:sz w:val="18"/>
+              </w:rPr>
+              <w:t>Cost to run</w:t>
+            </w:r>
+          </w:p>
+        </w:tc>
+        <w:tc>
+          <w:tcPr>
+            <w:tcW w:type="dxa" w:w="2736"/>
+            <w:shd w:fill="DCE6F1"/>
+          </w:tcPr>
+          <w:p>
+            <w:r/>
+            <w:r>
+              <w:rPr>
+                <w:b/>
+                <w:sz w:val="18"/>
+              </w:rPr>
+              <w:t>Position</w:t>
+            </w:r>
+          </w:p>
+        </w:tc>
+      </w:tr>
+      <w:tr>
+        <w:tc>
+          <w:tcPr>
+            <w:tcW w:type="dxa" w:w="1872"/>
+          </w:tcPr>
+          <w:p>
+            <w:pPr>
+              <w:spacing w:after="40"/>
+            </w:pPr>
+            <w:r/>
+            <w:r>
+              <w:rPr>
+                <w:sz w:val="18"/>
+              </w:rPr>
+              <w:t>Conservative (year 3)</w:t>
+            </w:r>
+          </w:p>
+        </w:tc>
+        <w:tc>
+          <w:tcPr>
+            <w:tcW w:type="dxa" w:w="3168"/>
+          </w:tcPr>
+          <w:p>
+            <w:pPr>
+              <w:spacing w:after="40"/>
+            </w:pPr>
+            <w:r/>
+            <w:r>
+              <w:rPr>
+                <w:sz w:val="18"/>
+              </w:rPr>
+              <w:t>One airline, 300 tails, one OEM programme, services ramp</w:t>
+            </w:r>
+          </w:p>
+        </w:tc>
+        <w:tc>
+          <w:tcPr>
+            <w:tcW w:type="dxa" w:w="1872"/>
+          </w:tcPr>
+          <w:p>
+            <w:pPr>
+              <w:spacing w:after="40"/>
+            </w:pPr>
+            <w:r/>
+            <w:r>
+              <w:rPr>
+                <w:sz w:val="18"/>
+              </w:rPr>
+              <w:t>USD 2.9 M</w:t>
+            </w:r>
+          </w:p>
+        </w:tc>
+        <w:tc>
+          <w:tcPr>
+            <w:tcW w:type="dxa" w:w="1440"/>
+          </w:tcPr>
+          <w:p>
+            <w:pPr>
+              <w:spacing w:after="40"/>
+            </w:pPr>
+            <w:r/>
+            <w:r>
+              <w:rPr>
+                <w:sz w:val="18"/>
+              </w:rPr>
+              <w:t>USD 0.9–1.2 M</w:t>
+            </w:r>
+          </w:p>
+        </w:tc>
+        <w:tc>
+          <w:tcPr>
+            <w:tcW w:type="dxa" w:w="2736"/>
+          </w:tcPr>
+          <w:p>
+            <w:pPr>
+              <w:spacing w:after="40"/>
+            </w:pPr>
+            <w:r/>
+            <w:r>
+              <w:rPr>
+                <w:sz w:val="18"/>
+              </w:rPr>
+              <w:t>Proves the mechanism and the pricing; roughly break-even including sales and legal</w:t>
+            </w:r>
+          </w:p>
+        </w:tc>
+      </w:tr>
+      <w:tr>
+        <w:tc>
+          <w:tcPr>
+            <w:tcW w:type="dxa" w:w="1872"/>
+          </w:tcPr>
+          <w:p>
+            <w:pPr>
+              <w:spacing w:after="40"/>
+            </w:pPr>
+            <w:r/>
+            <w:r>
+              <w:rPr>
+                <w:sz w:val="18"/>
+              </w:rPr>
+              <w:t>Base (year 3–4)</w:t>
+            </w:r>
+          </w:p>
+        </w:tc>
+        <w:tc>
+          <w:tcPr>
+            <w:tcW w:type="dxa" w:w="3168"/>
+          </w:tcPr>
+          <w:p>
+            <w:pPr>
+              <w:spacing w:after="40"/>
+            </w:pPr>
+            <w:r/>
+            <w:r>
+              <w:rPr>
+                <w:sz w:val="18"/>
+              </w:rPr>
+              <w:t>1,200 tails across two airlines, two OEM programmes</w:t>
+            </w:r>
+          </w:p>
+        </w:tc>
+        <w:tc>
+          <w:tcPr>
+            <w:tcW w:type="dxa" w:w="1872"/>
+          </w:tcPr>
+          <w:p>
+            <w:pPr>
+              <w:spacing w:after="40"/>
+            </w:pPr>
+            <w:r/>
+            <w:r>
+              <w:rPr>
+                <w:sz w:val="18"/>
+              </w:rPr>
+              <w:t>USD 11.4 M</w:t>
+            </w:r>
+          </w:p>
+        </w:tc>
+        <w:tc>
+          <w:tcPr>
+            <w:tcW w:type="dxa" w:w="1440"/>
+          </w:tcPr>
+          <w:p>
+            <w:pPr>
+              <w:spacing w:after="40"/>
+            </w:pPr>
+            <w:r/>
+            <w:r>
+              <w:rPr>
+                <w:sz w:val="18"/>
+              </w:rPr>
+              <w:t>USD 2.5–3.5 M</w:t>
+            </w:r>
+          </w:p>
+        </w:tc>
+        <w:tc>
+          <w:tcPr>
+            <w:tcW w:type="dxa" w:w="2736"/>
+          </w:tcPr>
+          <w:p>
+            <w:pPr>
+              <w:spacing w:after="40"/>
+            </w:pPr>
+            <w:r/>
+            <w:r>
+              <w:rPr>
+                <w:sz w:val="18"/>
+              </w:rPr>
+              <w:t>Profitable, with EBITDA around USD 3–5 M; the OEM line is already half the revenue</w:t>
+            </w:r>
+          </w:p>
+        </w:tc>
+      </w:tr>
+      <w:tr>
+        <w:tc>
+          <w:tcPr>
+            <w:tcW w:type="dxa" w:w="1872"/>
+          </w:tcPr>
+          <w:p>
+            <w:pPr>
+              <w:spacing w:after="40"/>
+            </w:pPr>
+            <w:r/>
+            <w:r>
+              <w:rPr>
+                <w:sz w:val="18"/>
+              </w:rPr>
+              <w:t>Upside (year 4)</w:t>
+            </w:r>
+          </w:p>
+        </w:tc>
+        <w:tc>
+          <w:tcPr>
+            <w:tcW w:type="dxa" w:w="3168"/>
+          </w:tcPr>
+          <w:p>
+            <w:pPr>
+              <w:spacing w:after="40"/>
+            </w:pPr>
+            <w:r/>
+            <w:r>
+              <w:rPr>
+                <w:sz w:val="18"/>
+              </w:rPr>
+              <w:t>3,000 tails, four OEM programmes, patent licensing</w:t>
+            </w:r>
+          </w:p>
+        </w:tc>
+        <w:tc>
+          <w:tcPr>
+            <w:tcW w:type="dxa" w:w="1872"/>
+          </w:tcPr>
+          <w:p>
+            <w:pPr>
+              <w:spacing w:after="40"/>
+            </w:pPr>
+            <w:r/>
+            <w:r>
+              <w:rPr>
+                <w:sz w:val="18"/>
+              </w:rPr>
+              <w:t>USD 36.5 M</w:t>
+            </w:r>
+          </w:p>
+        </w:tc>
+        <w:tc>
+          <w:tcPr>
+            <w:tcW w:type="dxa" w:w="1440"/>
+          </w:tcPr>
+          <w:p>
+            <w:pPr>
+              <w:spacing w:after="40"/>
+            </w:pPr>
+            <w:r/>
+            <w:r>
+              <w:rPr>
+                <w:sz w:val="18"/>
+              </w:rPr>
+              <w:t>USD 5–7 M</w:t>
+            </w:r>
+          </w:p>
+        </w:tc>
+        <w:tc>
+          <w:tcPr>
+            <w:tcW w:type="dxa" w:w="2736"/>
+          </w:tcPr>
+          <w:p>
+            <w:pPr>
+              <w:spacing w:after="40"/>
+            </w:pPr>
+            <w:r/>
+            <w:r>
+              <w:rPr>
+                <w:sz w:val="18"/>
+              </w:rPr>
+              <w:t>The reasonable ceiling of this idea if both the airline and the OEM sides land, against an addressable market of roughly USD 100–150 M a year</w:t>
+            </w:r>
+          </w:p>
+        </w:tc>
+      </w:tr>
+    </w:tbl>
+    <w:p>
+      <w:pPr>
+        <w:spacing w:after="40"/>
+      </w:pPr>
+    </w:p>
+    <w:p>
+      <w:pPr>
+        <w:sectPr>
+          <w:pgSz w:w="12240" w:h="15840"/>
+          <w:pgMar w:top="1008" w:right="1152" w:bottom="1008" w:left="1152" w:header="720" w:footer="720" w:gutter="0"/>
+          <w:cols w:space="720"/>
+          <w:docGrid w:linePitch="360"/>
+        </w:sectPr>
+      </w:pPr>
+    </w:p>
+    <w:p>
+      <w:pPr>
+        <w:spacing w:before="80" w:after="40"/>
+        <w:jc w:val="center"/>
+      </w:pPr>
+      <w:r>
+        <w:drawing>
+          <wp:inline xmlns:a="http://schemas.openxmlformats.org/drawingml/2006/main" xmlns:pic="http://schemas.openxmlformats.org/drawingml/2006/picture">
+            <wp:extent cx="8778240" cy="4267200"/>
+            <wp:docPr id="8" name="Picture 8"/>
+            <wp:cNvGraphicFramePr>
+              <a:graphicFrameLocks noChangeAspect="1"/>
+            </wp:cNvGraphicFramePr>
+            <a:graphic>
+              <a:graphicData uri="http://schemas.openxmlformats.org/drawingml/2006/picture">
+                <pic:pic>
+                  <pic:nvPicPr>
+                    <pic:cNvPr id="0" name="fig8_cost_revenue.png"/>
+                    <pic:cNvPicPr/>
+                  </pic:nvPicPr>
+                  <pic:blipFill>
+                    <a:blip r:embed="rId16"/>
+                    <a:stretch>
+                      <a:fillRect/>
+                    </a:stretch>
+                  </pic:blipFill>
+                  <pic:spPr>
+                    <a:xfrm>
+                      <a:off x="0" y="0"/>
+                      <a:ext cx="8778240" cy="4267200"/>
+                    </a:xfrm>
+                    <a:prstGeom prst="rect"/>
+                  </pic:spPr>
+                </pic:pic>
+              </a:graphicData>
+            </a:graphic>
+          </wp:inline>
+        </w:drawing>
+      </w:r>
+    </w:p>
+    <w:p>
+      <w:pPr>
+        <w:spacing w:after="200"/>
+        <w:jc w:val="center"/>
+      </w:pPr>
+      <w:r>
+        <w:rPr>
+          <w:i/>
+          <w:color w:val="445566"/>
+          <w:sz w:val="17"/>
+        </w:rPr>
+        <w:t>Figure 8 — Cost to build and run, and the three revenue scenarios. Left: the annual run-rate needed at pilot scale, approximately USD 0.7 M, with roughly USD 0.45–0.6 M to reach a defensible pilot with one airline. Right: revenue at maturity by scenario (log scale), against an addressable market of roughly USD 100–150 M a year. Estimates are indicative and to be validated by customer interviews.</w:t>
+      </w:r>
+    </w:p>
+    <w:p>
+      <w:pPr>
+        <w:sectPr>
+          <w:pgSz w:w="15840" w:h="12240" w:orient="landscape"/>
+          <w:pgMar w:top="720" w:right="792" w:bottom="720" w:left="792" w:header="720" w:footer="720" w:gutter="0"/>
+          <w:cols w:space="720"/>
+          <w:docGrid w:linePitch="360"/>
+        </w:sectPr>
+      </w:pPr>
+    </w:p>
+    <w:p>
+      <w:r>
+        <w:rPr>
+          <w:b w:val="0"/>
+          <w:i w:val="0"/>
+        </w:rPr>
+        <w:t>The cost story matters as much as the revenue story: this is a comparatively cheap business to run because the platform is a commodity software stack and the aircraft already produces the data. The expensive inputs are the data rights and the people, both of which scale sub-linearly with the number of tails after the first fleet. The single largest cost-avoidance decision is to sell to the OEM early: one OEM programme funds the platform development that a hundred airline subscriptions would otherwise have to fund.</w:t>
+      </w:r>
+    </w:p>
+    <w:p>
+      <w:pPr>
+        <w:pStyle w:val="Heading2"/>
+      </w:pPr>
+      <w:r>
+        <w:t>8.11 How the two buyers can share the cost, and why they each say yes</w:t>
+      </w:r>
+    </w:p>
+    <w:p>
+      <w:pPr>
+        <w:pStyle w:val="ListBullet"/>
+      </w:pPr>
+      <w:r>
+        <w:rPr>
+          <w:b/>
+        </w:rPr>
+        <w:t xml:space="preserve">Airline alone. </w:t>
+      </w:r>
+      <w:r>
+        <w:t>The airline pays the subscription and keeps the operational benefit. This is the simplest contract and the right starting point with a willing operator.</w:t>
+      </w:r>
+    </w:p>
+    <w:p>
+      <w:pPr>
+        <w:pStyle w:val="ListBullet"/>
+      </w:pPr>
+      <w:r>
+        <w:rPr>
+          <w:b/>
+        </w:rPr>
+        <w:t xml:space="preserve">OEM-sponsored (the structure that usually closes). </w:t>
+      </w:r>
+      <w:r>
+        <w:t>The OEM funds 30–60 % of the airline subscription in exchange for fleet-wide visibility of its own product and the labelled data that comes with it, out of a warranty and support saving that is larger than its contribution. The airline sees a lower net price; the OEM sees its own defect before anyone else does.</w:t>
+      </w:r>
+    </w:p>
+    <w:p>
+      <w:pPr>
+        <w:pStyle w:val="ListBullet"/>
+      </w:pPr>
+      <w:r>
+        <w:rPr>
+          <w:b/>
+        </w:rPr>
+        <w:t xml:space="preserve">OEM-direct (the highest-margin line). </w:t>
+      </w:r>
+      <w:r>
+        <w:t>The OEM licenses the platform for its own fleet monitoring across customer airlines. The platform owner does not need to win every airline individually, and the OEM gains a service line to sell with its existing contracts.</w:t>
+      </w:r>
+    </w:p>
+    <w:p>
+      <w:pPr>
+        <w:pStyle w:val="ListBullet"/>
+      </w:pPr>
+      <w:r>
+        <w:rPr>
+          <w:b/>
+        </w:rPr>
+        <w:t xml:space="preserve">Airline consortium or lessor arrangement. </w:t>
+      </w:r>
+      <w:r>
+        <w:t>Where several operators share a fleet type, aggregated benchmarks are a product in themselves — sold as reliability intelligence rather than as a monitoring tool.</w:t>
+      </w:r>
+    </w:p>
+    <w:p>
+      <w:pPr>
+        <w:pStyle w:val="ListBullet"/>
+      </w:pPr>
+      <w:r>
+        <w:rPr>
+          <w:b/>
+        </w:rPr>
+        <w:t xml:space="preserve">Authority-facing evidence. </w:t>
+      </w:r>
+      <w:r>
+        <w:t>The conformance record and coverage account have value beyond operations — to a regulator, a lessor or an insurer asking whether the datalink is working to its requirements. No one currently sells that answer.</w:t>
+      </w:r>
+    </w:p>
+    <w:p>
+      <w:pPr>
+        <w:pStyle w:val="Heading2"/>
+      </w:pPr>
+      <w:r>
+        <w:t>8.12 What has to be true for the upside (risks to the business case, not to the architecture)</w:t>
+      </w:r>
+    </w:p>
+    <w:tbl>
+      <w:tblPr>
+        <w:tblStyle w:val="TableGrid"/>
+        <w:tblW w:type="auto" w:w="0"/>
+        <w:jc w:val="center"/>
+        <w:tblLook w:firstColumn="1" w:firstRow="1" w:lastColumn="0" w:lastRow="0" w:noHBand="0" w:noVBand="1" w:val="04A0"/>
+      </w:tblPr>
+      <w:tblGrid>
+        <w:gridCol w:w="3312"/>
+        <w:gridCol w:w="3312"/>
+        <w:gridCol w:w="3312"/>
+      </w:tblGrid>
+      <w:tr>
+        <w:tc>
+          <w:tcPr>
+            <w:tcW w:type="dxa" w:w="2880"/>
+            <w:shd w:fill="DCE6F1"/>
+          </w:tcPr>
+          <w:p>
+            <w:r/>
+            <w:r>
+              <w:rPr>
+                <w:b/>
+                <w:sz w:val="18"/>
+              </w:rPr>
+              <w:t>Assumption</w:t>
+            </w:r>
+          </w:p>
+        </w:tc>
+        <w:tc>
+          <w:tcPr>
+            <w:tcW w:type="dxa" w:w="3456"/>
+            <w:shd w:fill="DCE6F1"/>
+          </w:tcPr>
+          <w:p>
+            <w:r/>
+            <w:r>
+              <w:rPr>
+                <w:b/>
+                <w:sz w:val="18"/>
+              </w:rPr>
+              <w:t>Why it is at risk</w:t>
+            </w:r>
+          </w:p>
+        </w:tc>
+        <w:tc>
+          <w:tcPr>
+            <w:tcW w:type="dxa" w:w="3600"/>
+            <w:shd w:fill="DCE6F1"/>
+          </w:tcPr>
+          <w:p>
+            <w:r/>
+            <w:r>
+              <w:rPr>
+                <w:b/>
+                <w:sz w:val="18"/>
+              </w:rPr>
+              <w:t>How it is de-risked</w:t>
+            </w:r>
+          </w:p>
+        </w:tc>
+      </w:tr>
+      <w:tr>
+        <w:tc>
+          <w:tcPr>
+            <w:tcW w:type="dxa" w:w="2880"/>
+          </w:tcPr>
+          <w:p>
+            <w:pPr>
+              <w:spacing w:after="40"/>
+            </w:pPr>
+            <w:r/>
+            <w:r>
+              <w:rPr>
+                <w:sz w:val="18"/>
+              </w:rPr>
+              <w:t>Data rights with the CSP and the airline can be obtained at a sane price</w:t>
+            </w:r>
+          </w:p>
+        </w:tc>
+        <w:tc>
+          <w:tcPr>
+            <w:tcW w:type="dxa" w:w="3456"/>
+          </w:tcPr>
+          <w:p>
+            <w:pPr>
+              <w:spacing w:after="40"/>
+            </w:pPr>
+            <w:r/>
+            <w:r>
+              <w:rPr>
+                <w:sz w:val="18"/>
+              </w:rPr>
+              <w:t>Message content is commercially sensitive and CSPs control the feed</w:t>
+            </w:r>
+          </w:p>
+        </w:tc>
+        <w:tc>
+          <w:tcPr>
+            <w:tcW w:type="dxa" w:w="3600"/>
+          </w:tcPr>
+          <w:p>
+            <w:pPr>
+              <w:spacing w:after="40"/>
+            </w:pPr>
+            <w:r/>
+            <w:r>
+              <w:rPr>
+                <w:sz w:val="18"/>
+              </w:rPr>
+              <w:t>Start with one airline and one CSP sandbox; use content hashes and redaction; price the licence into the subscription from day one</w:t>
+            </w:r>
+          </w:p>
+        </w:tc>
+      </w:tr>
+      <w:tr>
+        <w:tc>
+          <w:tcPr>
+            <w:tcW w:type="dxa" w:w="2880"/>
+          </w:tcPr>
+          <w:p>
+            <w:pPr>
+              <w:spacing w:after="40"/>
+            </w:pPr>
+            <w:r/>
+            <w:r>
+              <w:rPr>
+                <w:sz w:val="18"/>
+              </w:rPr>
+              <w:t>The configuration database is accurate</w:t>
+            </w:r>
+          </w:p>
+        </w:tc>
+        <w:tc>
+          <w:tcPr>
+            <w:tcW w:type="dxa" w:w="3456"/>
+          </w:tcPr>
+          <w:p>
+            <w:pPr>
+              <w:spacing w:after="40"/>
+            </w:pPr>
+            <w:r/>
+            <w:r>
+              <w:rPr>
+                <w:sz w:val="18"/>
+              </w:rPr>
+              <w:t>Every verdict is instantiated against it; wrong data means wrong verdicts</w:t>
+            </w:r>
+          </w:p>
+        </w:tc>
+        <w:tc>
+          <w:tcPr>
+            <w:tcW w:type="dxa" w:w="3600"/>
+          </w:tcPr>
+          <w:p>
+            <w:pPr>
+              <w:spacing w:after="40"/>
+            </w:pPr>
+            <w:r/>
+            <w:r>
+              <w:rPr>
+                <w:sz w:val="18"/>
+              </w:rPr>
+              <w:t>Make the configuration record the first paid deliverable of onboarding, and reconcile it against ground truth before any verdict is shown</w:t>
+            </w:r>
+          </w:p>
+        </w:tc>
+      </w:tr>
+      <w:tr>
+        <w:tc>
+          <w:tcPr>
+            <w:tcW w:type="dxa" w:w="2880"/>
+          </w:tcPr>
+          <w:p>
+            <w:pPr>
+              <w:spacing w:after="40"/>
+            </w:pPr>
+            <w:r/>
+            <w:r>
+              <w:rPr>
+                <w:sz w:val="18"/>
+              </w:rPr>
+              <w:t>Partition-depth evidence becomes available</w:t>
+            </w:r>
+          </w:p>
+        </w:tc>
+        <w:tc>
+          <w:tcPr>
+            <w:tcW w:type="dxa" w:w="3456"/>
+          </w:tcPr>
+          <w:p>
+            <w:pPr>
+              <w:spacing w:after="40"/>
+            </w:pPr>
+            <w:r/>
+            <w:r>
+              <w:rPr>
+                <w:sz w:val="18"/>
+              </w:rPr>
+              <w:t>It is the OEM partnership, which is slow</w:t>
+            </w:r>
+          </w:p>
+        </w:tc>
+        <w:tc>
+          <w:tcPr>
+            <w:tcW w:type="dxa" w:w="3600"/>
+          </w:tcPr>
+          <w:p>
+            <w:pPr>
+              <w:spacing w:after="40"/>
+            </w:pPr>
+            <w:r/>
+            <w:r>
+              <w:rPr>
+                <w:sz w:val="18"/>
+              </w:rPr>
+              <w:t>Product works at tier A and B without it; sell tier C when the OEM track lands, and treat it as the differentiator rather than the foundation</w:t>
+            </w:r>
+          </w:p>
+        </w:tc>
+      </w:tr>
+      <w:tr>
+        <w:tc>
+          <w:tcPr>
+            <w:tcW w:type="dxa" w:w="2880"/>
+          </w:tcPr>
+          <w:p>
+            <w:pPr>
+              <w:spacing w:after="40"/>
+            </w:pPr>
+            <w:r/>
+            <w:r>
+              <w:rPr>
+                <w:sz w:val="18"/>
+              </w:rPr>
+              <w:t>Requirements exist as machine-readable criteria</w:t>
+            </w:r>
+          </w:p>
+        </w:tc>
+        <w:tc>
+          <w:tcPr>
+            <w:tcW w:type="dxa" w:w="3456"/>
+          </w:tcPr>
+          <w:p>
+            <w:pPr>
+              <w:spacing w:after="40"/>
+            </w:pPr>
+            <w:r/>
+            <w:r>
+              <w:rPr>
+                <w:sz w:val="18"/>
+              </w:rPr>
+              <w:t>Some operators hold them in PDFs and spreadsheets</w:t>
+            </w:r>
+          </w:p>
+        </w:tc>
+        <w:tc>
+          <w:tcPr>
+            <w:tcW w:type="dxa" w:w="3600"/>
+          </w:tcPr>
+          <w:p>
+            <w:pPr>
+              <w:spacing w:after="40"/>
+            </w:pPr>
+            <w:r/>
+            <w:r>
+              <w:rPr>
+                <w:sz w:val="18"/>
+              </w:rPr>
+              <w:t>Selling the baseline as an engineering service is itself revenue, and the first thing the pilot pays for</w:t>
+            </w:r>
+          </w:p>
+        </w:tc>
+      </w:tr>
+      <w:tr>
+        <w:tc>
+          <w:tcPr>
+            <w:tcW w:type="dxa" w:w="2880"/>
+          </w:tcPr>
+          <w:p>
+            <w:pPr>
+              <w:spacing w:after="40"/>
+            </w:pPr>
+            <w:r/>
+            <w:r>
+              <w:rPr>
+                <w:sz w:val="18"/>
+              </w:rPr>
+              <w:t>The pricing is accepted</w:t>
+            </w:r>
+          </w:p>
+        </w:tc>
+        <w:tc>
+          <w:tcPr>
+            <w:tcW w:type="dxa" w:w="3456"/>
+          </w:tcPr>
+          <w:p>
+            <w:pPr>
+              <w:spacing w:after="40"/>
+            </w:pPr>
+            <w:r/>
+            <w:r>
+              <w:rPr>
+                <w:sz w:val="18"/>
+              </w:rPr>
+              <w:t>Airlines push hard on per-tail software pricing</w:t>
+            </w:r>
+          </w:p>
+        </w:tc>
+        <w:tc>
+          <w:tcPr>
+            <w:tcW w:type="dxa" w:w="3600"/>
+          </w:tcPr>
+          <w:p>
+            <w:pPr>
+              <w:spacing w:after="40"/>
+            </w:pPr>
+            <w:r/>
+            <w:r>
+              <w:rPr>
+                <w:sz w:val="18"/>
+              </w:rPr>
+              <w:t>Sell against measured payback (8.6) and use the OEM-sponsored structure when the year is tight</w:t>
+            </w:r>
+          </w:p>
+        </w:tc>
+      </w:tr>
+      <w:tr>
+        <w:tc>
+          <w:tcPr>
+            <w:tcW w:type="dxa" w:w="2880"/>
+          </w:tcPr>
+          <w:p>
+            <w:pPr>
+              <w:spacing w:after="40"/>
+            </w:pPr>
+            <w:r/>
+            <w:r>
+              <w:rPr>
+                <w:sz w:val="18"/>
+              </w:rPr>
+              <w:t>A CSP or an OEM builds it themselves</w:t>
+            </w:r>
+          </w:p>
+        </w:tc>
+        <w:tc>
+          <w:tcPr>
+            <w:tcW w:type="dxa" w:w="3456"/>
+          </w:tcPr>
+          <w:p>
+            <w:pPr>
+              <w:spacing w:after="40"/>
+            </w:pPr>
+            <w:r/>
+            <w:r>
+              <w:rPr>
+                <w:sz w:val="18"/>
+              </w:rPr>
+              <w:t>They own the data and the customer</w:t>
+            </w:r>
+          </w:p>
+        </w:tc>
+        <w:tc>
+          <w:tcPr>
+            <w:tcW w:type="dxa" w:w="3600"/>
+          </w:tcPr>
+          <w:p>
+            <w:pPr>
+              <w:spacing w:after="40"/>
+            </w:pPr>
+            <w:r/>
+            <w:r>
+              <w:rPr>
+                <w:sz w:val="18"/>
+              </w:rPr>
+              <w:t>The moat is the requirement-anchored verdict, the ledger and the evidence record — not the dashboard; move early and file the family</w:t>
+            </w:r>
+          </w:p>
+        </w:tc>
+      </w:tr>
+      <w:tr>
+        <w:tc>
+          <w:tcPr>
+            <w:tcW w:type="dxa" w:w="2880"/>
+          </w:tcPr>
+          <w:p>
+            <w:pPr>
+              <w:spacing w:after="40"/>
+            </w:pPr>
+            <w:r/>
+            <w:r>
+              <w:rPr>
+                <w:sz w:val="18"/>
+              </w:rPr>
+              <w:t>The market does not materialise within two years</w:t>
+            </w:r>
+          </w:p>
+        </w:tc>
+        <w:tc>
+          <w:tcPr>
+            <w:tcW w:type="dxa" w:w="3456"/>
+          </w:tcPr>
+          <w:p>
+            <w:pPr>
+              <w:spacing w:after="40"/>
+            </w:pPr>
+            <w:r/>
+            <w:r>
+              <w:rPr>
+                <w:sz w:val="18"/>
+              </w:rPr>
+              <w:t>Airline software sales cycles are long</w:t>
+            </w:r>
+          </w:p>
+        </w:tc>
+        <w:tc>
+          <w:tcPr>
+            <w:tcW w:type="dxa" w:w="3600"/>
+          </w:tcPr>
+          <w:p>
+            <w:pPr>
+              <w:spacing w:after="40"/>
+            </w:pPr>
+            <w:r/>
+            <w:r>
+              <w:rPr>
+                <w:sz w:val="18"/>
+              </w:rPr>
+              <w:t>The OEM line shortens the cycle; a single programme is worth dozens of airline deals</w:t>
+            </w:r>
+          </w:p>
+        </w:tc>
+      </w:tr>
+    </w:tbl>
+    <w:p>
+      <w:pPr>
+        <w:spacing w:after="40"/>
+      </w:pPr>
+    </w:p>
+    <w:p>
+      <w:pPr>
+        <w:pStyle w:val="Heading2"/>
+      </w:pPr>
+      <w:r>
+        <w:t>8.13 The business case in one paragraph</w:t>
+      </w:r>
+    </w:p>
+    <w:p>
+      <w:r>
+        <w:rPr>
+          <w:b w:val="0"/>
+          <w:i w:val="0"/>
+        </w:rPr>
+        <w:t>The platform turns data that aircraft and ground networks already produce into three things that are currently either unavailable or discovered too late: a per-requirement statement of whether the datalink is working as it was required to work, an early, evidence-backed warning that the datalink product is degrading on a specific tail and configuration, and a coverage account of what has never been demonstrated in service. An airline pays USD 3,600–6,000 per tail per year against hard savings that are plausibly one to three times that figure, and the same evidence is worth USD 1–5 M per programme per year to the OEM that owns the product, because it converts warranty, no-fault-found and support spend into a bounded, attributable, fixable problem — and it lets the OEM hear about its own defect before the customer does. The business can be run at roughly USD 0.7 M a year at pilot scale, reaches around USD 11 M a year in the base case and around USD 36 M in the upside, against an addressable market of roughly USD 100–150 M a year, on a software stack that is deliberately boring. The technical work in Sections 1–7 exists to make those numbers credible; the numbers exist to justify doing the technical work.</w:t>
+      </w:r>
+    </w:p>
+    <w:p>
+      <w:pPr>
+        <w:pStyle w:val="Heading1"/>
+      </w:pPr>
+      <w:r>
+        <w:t>9. Build order</w:t>
+      </w:r>
+    </w:p>
+    <w:tbl>
+      <w:tblPr>
+        <w:tblStyle w:val="TableGrid"/>
+        <w:tblW w:type="auto" w:w="0"/>
+        <w:jc w:val="center"/>
+        <w:tblLook w:firstColumn="1" w:firstRow="1" w:lastColumn="0" w:lastRow="0" w:noHBand="0" w:noVBand="1" w:val="04A0"/>
+      </w:tblPr>
+      <w:tblGrid>
+        <w:gridCol w:w="2484"/>
+        <w:gridCol w:w="2484"/>
+        <w:gridCol w:w="2484"/>
+        <w:gridCol w:w="2484"/>
+      </w:tblGrid>
+      <w:tr>
+        <w:tc>
+          <w:tcPr>
+            <w:tcW w:type="dxa" w:w="2160"/>
+            <w:shd w:fill="DCE6F1"/>
+          </w:tcPr>
+          <w:p>
+            <w:r/>
+            <w:r>
+              <w:rPr>
+                <w:b/>
+                <w:sz w:val="18"/>
+              </w:rPr>
               <w:t>Phase</w:t>
             </w:r>
           </w:p>
@@ -12511,7 +17336,7 @@
         <w:pStyle w:val="Heading1"/>
       </w:pPr>
       <w:r>
-        <w:t>9. What this architecture does for the patent position</w:t>
+        <w:t>10. What this architecture does for the patent position</w:t>
       </w:r>
     </w:p>
     <w:tbl>
@@ -12786,7 +17611,7 @@
         <w:pStyle w:val="Heading1"/>
       </w:pPr>
       <w:r>
-        <w:t>10. Risks and how to handle them</w:t>
+        <w:t>11. Risks and how to handle them</w:t>
       </w:r>
     </w:p>
     <w:tbl>

</xml_diff>